<commit_message>
Updated report section. Added JAG output in download section.
</commit_message>
<xml_diff>
--- a/Report/template.docx
+++ b/Report/template.docx
@@ -1,6 +1,6 @@
 
 <file path=word/document.xml><?xml version="1.0" encoding="utf-8"?>
-<w:document xmlns:wpc="http://schemas.microsoft.com/office/word/2010/wordprocessingCanvas" xmlns:cx="http://schemas.microsoft.com/office/drawing/2014/chartex" xmlns:cx1="http://schemas.microsoft.com/office/drawing/2015/9/8/chartex" xmlns:cx2="http://schemas.microsoft.com/office/drawing/2015/10/21/chartex" xmlns:cx3="http://schemas.microsoft.com/office/drawing/2016/5/9/chartex" xmlns:cx4="http://schemas.microsoft.com/office/drawing/2016/5/10/chartex" xmlns:cx5="http://schemas.microsoft.com/office/drawing/2016/5/11/chartex" xmlns:cx6="http://schemas.microsoft.com/office/drawing/2016/5/12/chartex" xmlns:cx7="http://schemas.microsoft.com/office/drawing/2016/5/13/chartex" xmlns:cx8="http://schemas.microsoft.com/office/drawing/2016/5/14/chartex" xmlns:mc="http://schemas.openxmlformats.org/markup-compatibility/2006" xmlns:aink="http://schemas.microsoft.com/office/drawing/2016/ink" xmlns:am3d="http://schemas.microsoft.com/office/drawing/2017/model3d" xmlns:o="urn:schemas-microsoft-com:office:office" xmlns:oel="http://schemas.microsoft.com/office/2019/extlst" xmlns:r="http://schemas.openxmlformats.org/officeDocument/2006/relationships" xmlns:m="http://schemas.openxmlformats.org/officeDocument/2006/math" xmlns:v="urn:schemas-microsoft-com:vml" xmlns:wp14="http://schemas.microsoft.com/office/word/2010/wordprocessingDrawing" xmlns:wp="http://schemas.openxmlformats.org/drawingml/2006/wordprocessingDrawing" xmlns:w10="urn:schemas-microsoft-com:office:word" xmlns:w="http://schemas.openxmlformats.org/wordprocessingml/2006/main" xmlns:w14="http://schemas.microsoft.com/office/word/2010/wordml" xmlns:w15="http://schemas.microsoft.com/office/word/2012/wordml" xmlns:w16cex="http://schemas.microsoft.com/office/word/2018/wordml/cex" xmlns:w16cid="http://schemas.microsoft.com/office/word/2016/wordml/cid" xmlns:w16="http://schemas.microsoft.com/office/word/2018/wordml" xmlns:w16sdtdh="http://schemas.microsoft.com/office/word/2020/wordml/sdtdatahash" xmlns:w16se="http://schemas.microsoft.com/office/word/2015/wordml/symex" xmlns:wpg="http://schemas.microsoft.com/office/word/2010/wordprocessingGroup" xmlns:wpi="http://schemas.microsoft.com/office/word/2010/wordprocessingInk" xmlns:wne="http://schemas.microsoft.com/office/word/2006/wordml" xmlns:wps="http://schemas.microsoft.com/office/word/2010/wordprocessingShape" mc:Ignorable="w14 w15 w16se w16cid w16 w16cex w16sdtdh wp14">
+<w:document xmlns:wpc="http://schemas.microsoft.com/office/word/2010/wordprocessingCanvas" xmlns:cx="http://schemas.microsoft.com/office/drawing/2014/chartex" xmlns:cx1="http://schemas.microsoft.com/office/drawing/2015/9/8/chartex" xmlns:cx2="http://schemas.microsoft.com/office/drawing/2015/10/21/chartex" xmlns:cx3="http://schemas.microsoft.com/office/drawing/2016/5/9/chartex" xmlns:cx4="http://schemas.microsoft.com/office/drawing/2016/5/10/chartex" xmlns:cx5="http://schemas.microsoft.com/office/drawing/2016/5/11/chartex" xmlns:cx6="http://schemas.microsoft.com/office/drawing/2016/5/12/chartex" xmlns:cx7="http://schemas.microsoft.com/office/drawing/2016/5/13/chartex" xmlns:cx8="http://schemas.microsoft.com/office/drawing/2016/5/14/chartex" xmlns:mc="http://schemas.openxmlformats.org/markup-compatibility/2006" xmlns:aink="http://schemas.microsoft.com/office/drawing/2016/ink" xmlns:am3d="http://schemas.microsoft.com/office/drawing/2017/model3d" xmlns:o="urn:schemas-microsoft-com:office:office" xmlns:oel="http://schemas.microsoft.com/office/2019/extlst" xmlns:r="http://schemas.openxmlformats.org/officeDocument/2006/relationships" xmlns:m="http://schemas.openxmlformats.org/officeDocument/2006/math" xmlns:v="urn:schemas-microsoft-com:vml" xmlns:wp14="http://schemas.microsoft.com/office/word/2010/wordprocessingDrawing" xmlns:wp="http://schemas.openxmlformats.org/drawingml/2006/wordprocessingDrawing" xmlns:w10="urn:schemas-microsoft-com:office:word" xmlns:w="http://schemas.openxmlformats.org/wordprocessingml/2006/main" xmlns:w14="http://schemas.microsoft.com/office/word/2010/wordml" xmlns:w15="http://schemas.microsoft.com/office/word/2012/wordml" xmlns:w16cex="http://schemas.microsoft.com/office/word/2018/wordml/cex" xmlns:w16cid="http://schemas.microsoft.com/office/word/2016/wordml/cid" xmlns:w16="http://schemas.microsoft.com/office/word/2018/wordml" xmlns:w16du="http://schemas.microsoft.com/office/word/2023/wordml/word16du" xmlns:w16sdtdh="http://schemas.microsoft.com/office/word/2020/wordml/sdtdatahash" xmlns:w16sdtfl="http://schemas.microsoft.com/office/word/2024/wordml/sdtformatlock" xmlns:w16se="http://schemas.microsoft.com/office/word/2015/wordml/symex" xmlns:wpg="http://schemas.microsoft.com/office/word/2010/wordprocessingGroup" xmlns:wpi="http://schemas.microsoft.com/office/word/2010/wordprocessingInk" xmlns:wne="http://schemas.microsoft.com/office/word/2006/wordml" xmlns:wps="http://schemas.microsoft.com/office/word/2010/wordprocessingShape" mc:Ignorable="w14 w15 w16se w16cid w16 w16cex w16sdtdh w16sdtfl w16du wp14">
   <w:body>
     <w:p>
       <w:pPr>
@@ -44,8 +44,6 @@
       <w:pPr>
         <w:pStyle w:val="Heading2"/>
       </w:pPr>
-      <w:bookmarkStart w:id="0" w:name="r-markdown"/>
-      <w:bookmarkEnd w:id="0"/>
     </w:p>
     <w:sdt>
       <w:sdtPr>
@@ -173,11 +171,11 @@
       <w:pPr>
         <w:pStyle w:val="Heading1"/>
       </w:pPr>
-      <w:bookmarkStart w:id="1" w:name="_Toc468217901"/>
+      <w:bookmarkStart w:id="0" w:name="_Toc468217901"/>
       <w:r>
         <w:t>Heading 1</w:t>
       </w:r>
-      <w:bookmarkEnd w:id="1"/>
+      <w:bookmarkEnd w:id="0"/>
     </w:p>
     <w:p/>
     <w:p>
@@ -341,15 +339,9 @@
           <w:color w:val="000000" w:themeColor="text1"/>
           <w:sz w:val="24"/>
         </w:rPr>
-        <w:t xml:space="preserve"> 4.0   Min.   :  2.00  </w:t>
-      </w:r>
-      <w:r>
-        <w:rPr>
-          <w:rFonts w:ascii="Times New Roman" w:hAnsi="Times New Roman" w:cs="Times New Roman"/>
-          <w:color w:val="000000" w:themeColor="text1"/>
-        </w:rPr>
-        <w:br/>
-      </w:r>
+        <w:t xml:space="preserve"> 4.0   Min. </w:t>
+      </w:r>
+      <w:proofErr w:type="gramStart"/>
       <w:r>
         <w:rPr>
           <w:rStyle w:val="VerbatimChar"/>
@@ -357,15 +349,9 @@
           <w:color w:val="000000" w:themeColor="text1"/>
           <w:sz w:val="24"/>
         </w:rPr>
-        <w:t xml:space="preserve">  1st Qu.:12.0   1st Qu.: 26.00  </w:t>
-      </w:r>
-      <w:r>
-        <w:rPr>
-          <w:rFonts w:ascii="Times New Roman" w:hAnsi="Times New Roman" w:cs="Times New Roman"/>
-          <w:color w:val="000000" w:themeColor="text1"/>
-        </w:rPr>
-        <w:br/>
-      </w:r>
+        <w:t xml:space="preserve">  :</w:t>
+      </w:r>
+      <w:proofErr w:type="gramEnd"/>
       <w:r>
         <w:rPr>
           <w:rStyle w:val="VerbatimChar"/>
@@ -373,7 +359,7 @@
           <w:color w:val="000000" w:themeColor="text1"/>
           <w:sz w:val="24"/>
         </w:rPr>
-        <w:t xml:space="preserve">  Median :15.0   Median : 36.00  </w:t>
+        <w:t xml:space="preserve">  2.00  </w:t>
       </w:r>
       <w:r>
         <w:rPr>
@@ -389,7 +375,7 @@
           <w:color w:val="000000" w:themeColor="text1"/>
           <w:sz w:val="24"/>
         </w:rPr>
-        <w:t xml:space="preserve">  Mean   :15.4   Mean   : 42.98  </w:t>
+        <w:t xml:space="preserve">  1st Qu.:12.0   1st Qu.: 26.00  </w:t>
       </w:r>
       <w:r>
         <w:rPr>
@@ -405,15 +391,9 @@
           <w:color w:val="000000" w:themeColor="text1"/>
           <w:sz w:val="24"/>
         </w:rPr>
-        <w:t xml:space="preserve">  3rd Qu.:19.0   3rd Qu.: 56.00  </w:t>
-      </w:r>
-      <w:r>
-        <w:rPr>
-          <w:rFonts w:ascii="Times New Roman" w:hAnsi="Times New Roman" w:cs="Times New Roman"/>
-          <w:color w:val="000000" w:themeColor="text1"/>
-        </w:rPr>
-        <w:br/>
-      </w:r>
+        <w:t xml:space="preserve">  Median :15.0   </w:t>
+      </w:r>
+      <w:proofErr w:type="gramStart"/>
       <w:r>
         <w:rPr>
           <w:rStyle w:val="VerbatimChar"/>
@@ -421,6 +401,84 @@
           <w:color w:val="000000" w:themeColor="text1"/>
           <w:sz w:val="24"/>
         </w:rPr>
+        <w:t>Median :</w:t>
+      </w:r>
+      <w:proofErr w:type="gramEnd"/>
+      <w:r>
+        <w:rPr>
+          <w:rStyle w:val="VerbatimChar"/>
+          <w:rFonts w:ascii="Times New Roman" w:hAnsi="Times New Roman" w:cs="Times New Roman"/>
+          <w:color w:val="000000" w:themeColor="text1"/>
+          <w:sz w:val="24"/>
+        </w:rPr>
+        <w:t xml:space="preserve"> 36.00  </w:t>
+      </w:r>
+      <w:r>
+        <w:rPr>
+          <w:rFonts w:ascii="Times New Roman" w:hAnsi="Times New Roman" w:cs="Times New Roman"/>
+          <w:color w:val="000000" w:themeColor="text1"/>
+        </w:rPr>
+        <w:br/>
+      </w:r>
+      <w:r>
+        <w:rPr>
+          <w:rStyle w:val="VerbatimChar"/>
+          <w:rFonts w:ascii="Times New Roman" w:hAnsi="Times New Roman" w:cs="Times New Roman"/>
+          <w:color w:val="000000" w:themeColor="text1"/>
+          <w:sz w:val="24"/>
+        </w:rPr>
+        <w:t xml:space="preserve">  Mean   :15.4   Mean </w:t>
+      </w:r>
+      <w:proofErr w:type="gramStart"/>
+      <w:r>
+        <w:rPr>
+          <w:rStyle w:val="VerbatimChar"/>
+          <w:rFonts w:ascii="Times New Roman" w:hAnsi="Times New Roman" w:cs="Times New Roman"/>
+          <w:color w:val="000000" w:themeColor="text1"/>
+          <w:sz w:val="24"/>
+        </w:rPr>
+        <w:t xml:space="preserve">  :</w:t>
+      </w:r>
+      <w:proofErr w:type="gramEnd"/>
+      <w:r>
+        <w:rPr>
+          <w:rStyle w:val="VerbatimChar"/>
+          <w:rFonts w:ascii="Times New Roman" w:hAnsi="Times New Roman" w:cs="Times New Roman"/>
+          <w:color w:val="000000" w:themeColor="text1"/>
+          <w:sz w:val="24"/>
+        </w:rPr>
+        <w:t xml:space="preserve"> 42.98  </w:t>
+      </w:r>
+      <w:r>
+        <w:rPr>
+          <w:rFonts w:ascii="Times New Roman" w:hAnsi="Times New Roman" w:cs="Times New Roman"/>
+          <w:color w:val="000000" w:themeColor="text1"/>
+        </w:rPr>
+        <w:br/>
+      </w:r>
+      <w:r>
+        <w:rPr>
+          <w:rStyle w:val="VerbatimChar"/>
+          <w:rFonts w:ascii="Times New Roman" w:hAnsi="Times New Roman" w:cs="Times New Roman"/>
+          <w:color w:val="000000" w:themeColor="text1"/>
+          <w:sz w:val="24"/>
+        </w:rPr>
+        <w:t xml:space="preserve">  3rd Qu.:19.0   3rd Qu.: 56.00  </w:t>
+      </w:r>
+      <w:r>
+        <w:rPr>
+          <w:rFonts w:ascii="Times New Roman" w:hAnsi="Times New Roman" w:cs="Times New Roman"/>
+          <w:color w:val="000000" w:themeColor="text1"/>
+        </w:rPr>
+        <w:br/>
+      </w:r>
+      <w:r>
+        <w:rPr>
+          <w:rStyle w:val="VerbatimChar"/>
+          <w:rFonts w:ascii="Times New Roman" w:hAnsi="Times New Roman" w:cs="Times New Roman"/>
+          <w:color w:val="000000" w:themeColor="text1"/>
+          <w:sz w:val="24"/>
+        </w:rPr>
         <w:t xml:space="preserve">  Max.   :25.0   Max.   :120.00</w:t>
       </w:r>
     </w:p>
@@ -428,8 +486,8 @@
       <w:pPr>
         <w:pStyle w:val="Heading2"/>
       </w:pPr>
-      <w:bookmarkStart w:id="2" w:name="including-plots"/>
-      <w:bookmarkEnd w:id="2"/>
+      <w:bookmarkStart w:id="1" w:name="including-plots"/>
+      <w:bookmarkEnd w:id="1"/>
       <w:r>
         <w:lastRenderedPageBreak/>
         <w:t>Including Plots</w:t>
@@ -458,9 +516,9 @@
           <w:noProof/>
         </w:rPr>
         <w:drawing>
-          <wp:inline distT="0" distB="0" distL="0" distR="0" wp14:anchorId="04DF0172" wp14:editId="7A471E2B">
-            <wp:extent cx="5334000" cy="4148666"/>
-            <wp:effectExtent l="0" t="0" r="0" b="0"/>
+          <wp:inline distT="0" distB="0" distL="0" distR="0" wp14:anchorId="04DF0172" wp14:editId="5FA07D81">
+            <wp:extent cx="5844540" cy="4000500"/>
+            <wp:effectExtent l="0" t="0" r="3810" b="0"/>
             <wp:docPr id="4" name="Picture" descr="Chart, scatter chart&#10;&#10;Description automatically generated"/>
             <wp:cNvGraphicFramePr/>
             <a:graphic xmlns:a="http://schemas.openxmlformats.org/drawingml/2006/main">
@@ -481,7 +539,7 @@
                   <pic:spPr bwMode="auto">
                     <a:xfrm>
                       <a:off x="0" y="0"/>
-                      <a:ext cx="5334000" cy="4148666"/>
+                      <a:ext cx="5844837" cy="4000703"/>
                     </a:xfrm>
                     <a:prstGeom prst="rect">
                       <a:avLst/>
@@ -545,19 +603,19 @@
     <w:tbl>
       <w:tblPr>
         <w:tblStyle w:val="Table"/>
-        <w:tblW w:w="0" w:type="auto"/>
+        <w:tblW w:w="6977" w:type="dxa"/>
         <w:tblLook w:val="0020" w:firstRow="1" w:lastRow="0" w:firstColumn="0" w:lastColumn="0" w:noHBand="0" w:noVBand="0"/>
         <w:tblCaption w:val="Table 3. Standard Spawner Recruit Analyses summary. Note: outliers were removed."/>
       </w:tblPr>
       <w:tblGrid>
-        <w:gridCol w:w="889"/>
-        <w:gridCol w:w="711"/>
-        <w:gridCol w:w="864"/>
-        <w:gridCol w:w="711"/>
-        <w:gridCol w:w="876"/>
-        <w:gridCol w:w="766"/>
-        <w:gridCol w:w="742"/>
-        <w:gridCol w:w="876"/>
+        <w:gridCol w:w="950"/>
+        <w:gridCol w:w="790"/>
+        <w:gridCol w:w="990"/>
+        <w:gridCol w:w="756"/>
+        <w:gridCol w:w="936"/>
+        <w:gridCol w:w="816"/>
+        <w:gridCol w:w="803"/>
+        <w:gridCol w:w="936"/>
       </w:tblGrid>
       <w:tr>
         <w:trPr>
@@ -566,51 +624,77 @@
         </w:trPr>
         <w:tc>
           <w:tcPr>
-            <w:tcW w:w="0" w:type="auto"/>
+            <w:tcW w:w="950" w:type="dxa"/>
             <w:tcBorders>
               <w:top w:val="single" w:sz="4" w:space="0" w:color="auto"/>
               <w:bottom w:val="single" w:sz="4" w:space="0" w:color="auto"/>
             </w:tcBorders>
-          </w:tcPr>
-          <w:p>
-            <w:pPr>
-              <w:pStyle w:val="Compact"/>
-            </w:pPr>
-          </w:p>
-        </w:tc>
-        <w:tc>
-          <w:tcPr>
-            <w:tcW w:w="0" w:type="auto"/>
+            <w:vAlign w:val="center"/>
+          </w:tcPr>
+          <w:p>
+            <w:pPr>
+              <w:pStyle w:val="Compact"/>
+              <w:rPr>
+                <w:sz w:val="24"/>
+              </w:rPr>
+            </w:pPr>
+          </w:p>
+        </w:tc>
+        <w:tc>
+          <w:tcPr>
+            <w:tcW w:w="790" w:type="dxa"/>
             <w:tcBorders>
               <w:top w:val="single" w:sz="4" w:space="0" w:color="auto"/>
               <w:bottom w:val="single" w:sz="4" w:space="0" w:color="auto"/>
             </w:tcBorders>
+            <w:vAlign w:val="center"/>
           </w:tcPr>
           <w:p>
             <w:pPr>
               <w:pStyle w:val="Compact"/>
               <w:jc w:val="right"/>
-            </w:pPr>
-            <w:r>
+              <w:rPr>
+                <w:b/>
+                <w:bCs/>
+                <w:sz w:val="24"/>
+              </w:rPr>
+            </w:pPr>
+            <w:r>
+              <w:rPr>
+                <w:b/>
+                <w:bCs/>
+                <w:sz w:val="24"/>
+              </w:rPr>
               <w:t>alpha</w:t>
             </w:r>
           </w:p>
         </w:tc>
         <w:tc>
           <w:tcPr>
-            <w:tcW w:w="0" w:type="auto"/>
+            <w:tcW w:w="990" w:type="dxa"/>
             <w:tcBorders>
               <w:top w:val="single" w:sz="4" w:space="0" w:color="auto"/>
               <w:bottom w:val="single" w:sz="4" w:space="0" w:color="auto"/>
             </w:tcBorders>
+            <w:vAlign w:val="center"/>
           </w:tcPr>
           <w:p>
             <w:pPr>
               <w:pStyle w:val="Compact"/>
               <w:jc w:val="right"/>
+              <w:rPr>
+                <w:b/>
+                <w:bCs/>
+                <w:sz w:val="24"/>
+              </w:rPr>
             </w:pPr>
             <w:proofErr w:type="spellStart"/>
             <w:r>
+              <w:rPr>
+                <w:b/>
+                <w:bCs/>
+                <w:sz w:val="24"/>
+              </w:rPr>
               <w:t>lnalpha</w:t>
             </w:r>
             <w:proofErr w:type="spellEnd"/>
@@ -618,55 +702,88 @@
         </w:tc>
         <w:tc>
           <w:tcPr>
-            <w:tcW w:w="0" w:type="auto"/>
+            <w:tcW w:w="756" w:type="dxa"/>
             <w:tcBorders>
               <w:top w:val="single" w:sz="4" w:space="0" w:color="auto"/>
               <w:bottom w:val="single" w:sz="4" w:space="0" w:color="auto"/>
             </w:tcBorders>
+            <w:vAlign w:val="center"/>
           </w:tcPr>
           <w:p>
             <w:pPr>
               <w:pStyle w:val="Compact"/>
               <w:jc w:val="right"/>
-            </w:pPr>
-            <w:r>
+              <w:rPr>
+                <w:b/>
+                <w:bCs/>
+                <w:sz w:val="24"/>
+              </w:rPr>
+            </w:pPr>
+            <w:r>
+              <w:rPr>
+                <w:b/>
+                <w:bCs/>
+                <w:sz w:val="24"/>
+              </w:rPr>
               <w:t>beta</w:t>
             </w:r>
           </w:p>
         </w:tc>
         <w:tc>
           <w:tcPr>
-            <w:tcW w:w="0" w:type="auto"/>
+            <w:tcW w:w="936" w:type="dxa"/>
             <w:tcBorders>
               <w:top w:val="single" w:sz="4" w:space="0" w:color="auto"/>
               <w:bottom w:val="single" w:sz="4" w:space="0" w:color="auto"/>
             </w:tcBorders>
+            <w:vAlign w:val="center"/>
           </w:tcPr>
           <w:p>
             <w:pPr>
               <w:pStyle w:val="Compact"/>
               <w:jc w:val="right"/>
-            </w:pPr>
-            <w:r>
+              <w:rPr>
+                <w:b/>
+                <w:bCs/>
+                <w:sz w:val="24"/>
+              </w:rPr>
+            </w:pPr>
+            <w:r>
+              <w:rPr>
+                <w:b/>
+                <w:bCs/>
+                <w:sz w:val="24"/>
+              </w:rPr>
               <w:t>Seq</w:t>
             </w:r>
           </w:p>
         </w:tc>
         <w:tc>
           <w:tcPr>
-            <w:tcW w:w="0" w:type="auto"/>
+            <w:tcW w:w="816" w:type="dxa"/>
             <w:tcBorders>
               <w:top w:val="single" w:sz="4" w:space="0" w:color="auto"/>
               <w:bottom w:val="single" w:sz="4" w:space="0" w:color="auto"/>
             </w:tcBorders>
+            <w:vAlign w:val="center"/>
           </w:tcPr>
           <w:p>
             <w:pPr>
               <w:pStyle w:val="Compact"/>
               <w:jc w:val="right"/>
+              <w:rPr>
+                <w:b/>
+                <w:bCs/>
+                <w:sz w:val="24"/>
+              </w:rPr>
             </w:pPr>
             <w:proofErr w:type="spellStart"/>
             <w:r>
+              <w:rPr>
+                <w:b/>
+                <w:bCs/>
+                <w:sz w:val="24"/>
+              </w:rPr>
               <w:t>Smsy</w:t>
             </w:r>
             <w:proofErr w:type="spellEnd"/>
@@ -674,19 +791,30 @@
         </w:tc>
         <w:tc>
           <w:tcPr>
-            <w:tcW w:w="0" w:type="auto"/>
+            <w:tcW w:w="803" w:type="dxa"/>
             <w:tcBorders>
               <w:top w:val="single" w:sz="4" w:space="0" w:color="auto"/>
               <w:bottom w:val="single" w:sz="4" w:space="0" w:color="auto"/>
             </w:tcBorders>
+            <w:vAlign w:val="center"/>
           </w:tcPr>
           <w:p>
             <w:pPr>
               <w:pStyle w:val="Compact"/>
               <w:jc w:val="right"/>
+              <w:rPr>
+                <w:b/>
+                <w:bCs/>
+                <w:sz w:val="24"/>
+              </w:rPr>
             </w:pPr>
             <w:proofErr w:type="spellStart"/>
             <w:r>
+              <w:rPr>
+                <w:b/>
+                <w:bCs/>
+                <w:sz w:val="24"/>
+              </w:rPr>
               <w:t>Umsy</w:t>
             </w:r>
             <w:proofErr w:type="spellEnd"/>
@@ -694,18 +822,29 @@
         </w:tc>
         <w:tc>
           <w:tcPr>
-            <w:tcW w:w="0" w:type="auto"/>
+            <w:tcW w:w="936" w:type="dxa"/>
             <w:tcBorders>
               <w:top w:val="single" w:sz="4" w:space="0" w:color="auto"/>
               <w:bottom w:val="single" w:sz="4" w:space="0" w:color="auto"/>
             </w:tcBorders>
+            <w:vAlign w:val="center"/>
           </w:tcPr>
           <w:p>
             <w:pPr>
               <w:pStyle w:val="Compact"/>
               <w:jc w:val="right"/>
-            </w:pPr>
-            <w:r>
+              <w:rPr>
+                <w:b/>
+                <w:bCs/>
+                <w:sz w:val="24"/>
+              </w:rPr>
+            </w:pPr>
+            <w:r>
+              <w:rPr>
+                <w:b/>
+                <w:bCs/>
+                <w:sz w:val="24"/>
+              </w:rPr>
               <w:t>Smax</w:t>
             </w:r>
           </w:p>
@@ -714,135 +853,191 @@
       <w:tr>
         <w:tc>
           <w:tcPr>
-            <w:tcW w:w="0" w:type="auto"/>
+            <w:tcW w:w="950" w:type="dxa"/>
             <w:tcBorders>
               <w:top w:val="single" w:sz="4" w:space="0" w:color="auto"/>
             </w:tcBorders>
-          </w:tcPr>
-          <w:p>
-            <w:pPr>
-              <w:pStyle w:val="Compact"/>
-            </w:pPr>
-            <w:r>
+            <w:vAlign w:val="center"/>
+          </w:tcPr>
+          <w:p>
+            <w:pPr>
+              <w:pStyle w:val="Compact"/>
+              <w:rPr>
+                <w:sz w:val="24"/>
+              </w:rPr>
+            </w:pPr>
+            <w:r>
+              <w:rPr>
+                <w:sz w:val="24"/>
+              </w:rPr>
               <w:t>Min</w:t>
             </w:r>
           </w:p>
         </w:tc>
         <w:tc>
           <w:tcPr>
-            <w:tcW w:w="0" w:type="auto"/>
+            <w:tcW w:w="790" w:type="dxa"/>
             <w:tcBorders>
               <w:top w:val="single" w:sz="4" w:space="0" w:color="auto"/>
             </w:tcBorders>
+            <w:vAlign w:val="center"/>
           </w:tcPr>
           <w:p>
             <w:pPr>
               <w:pStyle w:val="Compact"/>
               <w:jc w:val="right"/>
-            </w:pPr>
-            <w:r>
+              <w:rPr>
+                <w:sz w:val="24"/>
+              </w:rPr>
+            </w:pPr>
+            <w:r>
+              <w:rPr>
+                <w:sz w:val="24"/>
+              </w:rPr>
               <w:t>3.719</w:t>
             </w:r>
           </w:p>
         </w:tc>
         <w:tc>
           <w:tcPr>
-            <w:tcW w:w="0" w:type="auto"/>
+            <w:tcW w:w="990" w:type="dxa"/>
             <w:tcBorders>
               <w:top w:val="single" w:sz="4" w:space="0" w:color="auto"/>
             </w:tcBorders>
+            <w:vAlign w:val="center"/>
           </w:tcPr>
           <w:p>
             <w:pPr>
               <w:pStyle w:val="Compact"/>
               <w:jc w:val="right"/>
-            </w:pPr>
-            <w:r>
+              <w:rPr>
+                <w:sz w:val="24"/>
+              </w:rPr>
+            </w:pPr>
+            <w:r>
+              <w:rPr>
+                <w:sz w:val="24"/>
+              </w:rPr>
               <w:t>1.313</w:t>
             </w:r>
           </w:p>
         </w:tc>
         <w:tc>
           <w:tcPr>
-            <w:tcW w:w="0" w:type="auto"/>
+            <w:tcW w:w="756" w:type="dxa"/>
             <w:tcBorders>
               <w:top w:val="single" w:sz="4" w:space="0" w:color="auto"/>
             </w:tcBorders>
+            <w:vAlign w:val="center"/>
           </w:tcPr>
           <w:p>
             <w:pPr>
               <w:pStyle w:val="Compact"/>
               <w:jc w:val="right"/>
-            </w:pPr>
-            <w:r>
+              <w:rPr>
+                <w:sz w:val="24"/>
+              </w:rPr>
+            </w:pPr>
+            <w:r>
+              <w:rPr>
+                <w:sz w:val="24"/>
+              </w:rPr>
               <w:t>0.740</w:t>
             </w:r>
           </w:p>
         </w:tc>
         <w:tc>
           <w:tcPr>
-            <w:tcW w:w="0" w:type="auto"/>
+            <w:tcW w:w="936" w:type="dxa"/>
             <w:tcBorders>
               <w:top w:val="single" w:sz="4" w:space="0" w:color="auto"/>
             </w:tcBorders>
+            <w:vAlign w:val="center"/>
           </w:tcPr>
           <w:p>
             <w:pPr>
               <w:pStyle w:val="Compact"/>
               <w:jc w:val="right"/>
-            </w:pPr>
-            <w:r>
+              <w:rPr>
+                <w:sz w:val="24"/>
+              </w:rPr>
+            </w:pPr>
+            <w:r>
+              <w:rPr>
+                <w:sz w:val="24"/>
+              </w:rPr>
               <w:t>160307</w:t>
             </w:r>
           </w:p>
         </w:tc>
         <w:tc>
           <w:tcPr>
-            <w:tcW w:w="0" w:type="auto"/>
+            <w:tcW w:w="816" w:type="dxa"/>
             <w:tcBorders>
               <w:top w:val="single" w:sz="4" w:space="0" w:color="auto"/>
             </w:tcBorders>
+            <w:vAlign w:val="center"/>
           </w:tcPr>
           <w:p>
             <w:pPr>
               <w:pStyle w:val="Compact"/>
               <w:jc w:val="right"/>
-            </w:pPr>
-            <w:r>
+              <w:rPr>
+                <w:sz w:val="24"/>
+              </w:rPr>
+            </w:pPr>
+            <w:r>
+              <w:rPr>
+                <w:sz w:val="24"/>
+              </w:rPr>
               <w:t>58991</w:t>
             </w:r>
           </w:p>
         </w:tc>
         <w:tc>
           <w:tcPr>
-            <w:tcW w:w="0" w:type="auto"/>
+            <w:tcW w:w="803" w:type="dxa"/>
             <w:tcBorders>
               <w:top w:val="single" w:sz="4" w:space="0" w:color="auto"/>
             </w:tcBorders>
+            <w:vAlign w:val="center"/>
           </w:tcPr>
           <w:p>
             <w:pPr>
               <w:pStyle w:val="Compact"/>
               <w:jc w:val="right"/>
-            </w:pPr>
-            <w:r>
+              <w:rPr>
+                <w:sz w:val="24"/>
+              </w:rPr>
+            </w:pPr>
+            <w:r>
+              <w:rPr>
+                <w:sz w:val="24"/>
+              </w:rPr>
               <w:t>0.536</w:t>
             </w:r>
           </w:p>
         </w:tc>
         <w:tc>
           <w:tcPr>
-            <w:tcW w:w="0" w:type="auto"/>
+            <w:tcW w:w="936" w:type="dxa"/>
             <w:tcBorders>
               <w:top w:val="single" w:sz="4" w:space="0" w:color="auto"/>
             </w:tcBorders>
+            <w:vAlign w:val="center"/>
           </w:tcPr>
           <w:p>
             <w:pPr>
               <w:pStyle w:val="Compact"/>
               <w:jc w:val="right"/>
-            </w:pPr>
-            <w:r>
+              <w:rPr>
+                <w:sz w:val="24"/>
+              </w:rPr>
+            </w:pPr>
+            <w:r>
+              <w:rPr>
+                <w:sz w:val="24"/>
+              </w:rPr>
               <w:t>80108</w:t>
             </w:r>
           </w:p>
@@ -851,111 +1046,167 @@
       <w:tr>
         <w:tc>
           <w:tcPr>
-            <w:tcW w:w="0" w:type="auto"/>
-          </w:tcPr>
-          <w:p>
-            <w:pPr>
-              <w:pStyle w:val="Compact"/>
-            </w:pPr>
-            <w:r>
+            <w:tcW w:w="950" w:type="dxa"/>
+            <w:vAlign w:val="center"/>
+          </w:tcPr>
+          <w:p>
+            <w:pPr>
+              <w:pStyle w:val="Compact"/>
+              <w:rPr>
+                <w:sz w:val="24"/>
+              </w:rPr>
+            </w:pPr>
+            <w:r>
+              <w:rPr>
+                <w:sz w:val="24"/>
+              </w:rPr>
               <w:t>5%</w:t>
             </w:r>
           </w:p>
         </w:tc>
         <w:tc>
           <w:tcPr>
-            <w:tcW w:w="0" w:type="auto"/>
+            <w:tcW w:w="790" w:type="dxa"/>
+            <w:vAlign w:val="center"/>
           </w:tcPr>
           <w:p>
             <w:pPr>
               <w:pStyle w:val="Compact"/>
               <w:jc w:val="right"/>
-            </w:pPr>
-            <w:r>
+              <w:rPr>
+                <w:sz w:val="24"/>
+              </w:rPr>
+            </w:pPr>
+            <w:r>
+              <w:rPr>
+                <w:sz w:val="24"/>
+              </w:rPr>
               <w:t>4.572</w:t>
             </w:r>
           </w:p>
         </w:tc>
         <w:tc>
           <w:tcPr>
-            <w:tcW w:w="0" w:type="auto"/>
+            <w:tcW w:w="990" w:type="dxa"/>
+            <w:vAlign w:val="center"/>
           </w:tcPr>
           <w:p>
             <w:pPr>
               <w:pStyle w:val="Compact"/>
               <w:jc w:val="right"/>
-            </w:pPr>
-            <w:r>
+              <w:rPr>
+                <w:sz w:val="24"/>
+              </w:rPr>
+            </w:pPr>
+            <w:r>
+              <w:rPr>
+                <w:sz w:val="24"/>
+              </w:rPr>
               <w:t>1.520</w:t>
             </w:r>
           </w:p>
         </w:tc>
         <w:tc>
           <w:tcPr>
-            <w:tcW w:w="0" w:type="auto"/>
+            <w:tcW w:w="756" w:type="dxa"/>
+            <w:vAlign w:val="center"/>
           </w:tcPr>
           <w:p>
             <w:pPr>
               <w:pStyle w:val="Compact"/>
               <w:jc w:val="right"/>
-            </w:pPr>
-            <w:r>
+              <w:rPr>
+                <w:sz w:val="24"/>
+              </w:rPr>
+            </w:pPr>
+            <w:r>
+              <w:rPr>
+                <w:sz w:val="24"/>
+              </w:rPr>
               <w:t>0.801</w:t>
             </w:r>
           </w:p>
         </w:tc>
         <w:tc>
           <w:tcPr>
-            <w:tcW w:w="0" w:type="auto"/>
+            <w:tcW w:w="936" w:type="dxa"/>
+            <w:vAlign w:val="center"/>
           </w:tcPr>
           <w:p>
             <w:pPr>
               <w:pStyle w:val="Compact"/>
               <w:jc w:val="right"/>
-            </w:pPr>
-            <w:r>
+              <w:rPr>
+                <w:sz w:val="24"/>
+              </w:rPr>
+            </w:pPr>
+            <w:r>
+              <w:rPr>
+                <w:sz w:val="24"/>
+              </w:rPr>
               <w:t>170404</w:t>
             </w:r>
           </w:p>
         </w:tc>
         <w:tc>
           <w:tcPr>
-            <w:tcW w:w="0" w:type="auto"/>
+            <w:tcW w:w="816" w:type="dxa"/>
+            <w:vAlign w:val="center"/>
           </w:tcPr>
           <w:p>
             <w:pPr>
               <w:pStyle w:val="Compact"/>
               <w:jc w:val="right"/>
-            </w:pPr>
-            <w:r>
+              <w:rPr>
+                <w:sz w:val="24"/>
+              </w:rPr>
+            </w:pPr>
+            <w:r>
+              <w:rPr>
+                <w:sz w:val="24"/>
+              </w:rPr>
               <w:t>63211</w:t>
             </w:r>
           </w:p>
         </w:tc>
         <w:tc>
           <w:tcPr>
-            <w:tcW w:w="0" w:type="auto"/>
+            <w:tcW w:w="803" w:type="dxa"/>
+            <w:vAlign w:val="center"/>
           </w:tcPr>
           <w:p>
             <w:pPr>
               <w:pStyle w:val="Compact"/>
               <w:jc w:val="right"/>
-            </w:pPr>
-            <w:r>
+              <w:rPr>
+                <w:sz w:val="24"/>
+              </w:rPr>
+            </w:pPr>
+            <w:r>
+              <w:rPr>
+                <w:sz w:val="24"/>
+              </w:rPr>
               <w:t>0.598</w:t>
             </w:r>
           </w:p>
         </w:tc>
         <w:tc>
           <w:tcPr>
-            <w:tcW w:w="0" w:type="auto"/>
+            <w:tcW w:w="936" w:type="dxa"/>
+            <w:vAlign w:val="center"/>
           </w:tcPr>
           <w:p>
             <w:pPr>
               <w:pStyle w:val="Compact"/>
               <w:jc w:val="right"/>
-            </w:pPr>
-            <w:r>
+              <w:rPr>
+                <w:sz w:val="24"/>
+              </w:rPr>
+            </w:pPr>
+            <w:r>
+              <w:rPr>
+                <w:sz w:val="24"/>
+              </w:rPr>
               <w:t>88951</w:t>
             </w:r>
           </w:p>
@@ -964,111 +1215,167 @@
       <w:tr>
         <w:tc>
           <w:tcPr>
-            <w:tcW w:w="0" w:type="auto"/>
-          </w:tcPr>
-          <w:p>
-            <w:pPr>
-              <w:pStyle w:val="Compact"/>
-            </w:pPr>
-            <w:r>
+            <w:tcW w:w="950" w:type="dxa"/>
+            <w:vAlign w:val="center"/>
+          </w:tcPr>
+          <w:p>
+            <w:pPr>
+              <w:pStyle w:val="Compact"/>
+              <w:rPr>
+                <w:sz w:val="24"/>
+              </w:rPr>
+            </w:pPr>
+            <w:r>
+              <w:rPr>
+                <w:sz w:val="24"/>
+              </w:rPr>
               <w:t>Mean</w:t>
             </w:r>
           </w:p>
         </w:tc>
         <w:tc>
           <w:tcPr>
-            <w:tcW w:w="0" w:type="auto"/>
+            <w:tcW w:w="790" w:type="dxa"/>
+            <w:vAlign w:val="center"/>
           </w:tcPr>
           <w:p>
             <w:pPr>
               <w:pStyle w:val="Compact"/>
               <w:jc w:val="right"/>
-            </w:pPr>
-            <w:r>
+              <w:rPr>
+                <w:sz w:val="24"/>
+              </w:rPr>
+            </w:pPr>
+            <w:r>
+              <w:rPr>
+                <w:sz w:val="24"/>
+              </w:rPr>
               <w:t>5.961</w:t>
             </w:r>
           </w:p>
         </w:tc>
         <w:tc>
           <w:tcPr>
-            <w:tcW w:w="0" w:type="auto"/>
+            <w:tcW w:w="990" w:type="dxa"/>
+            <w:vAlign w:val="center"/>
           </w:tcPr>
           <w:p>
             <w:pPr>
               <w:pStyle w:val="Compact"/>
               <w:jc w:val="right"/>
-            </w:pPr>
-            <w:r>
+              <w:rPr>
+                <w:sz w:val="24"/>
+              </w:rPr>
+            </w:pPr>
+            <w:r>
+              <w:rPr>
+                <w:sz w:val="24"/>
+              </w:rPr>
               <w:t>1.774</w:t>
             </w:r>
           </w:p>
         </w:tc>
         <w:tc>
           <w:tcPr>
-            <w:tcW w:w="0" w:type="auto"/>
+            <w:tcW w:w="756" w:type="dxa"/>
+            <w:vAlign w:val="center"/>
           </w:tcPr>
           <w:p>
             <w:pPr>
               <w:pStyle w:val="Compact"/>
               <w:jc w:val="right"/>
-            </w:pPr>
-            <w:r>
+              <w:rPr>
+                <w:sz w:val="24"/>
+              </w:rPr>
+            </w:pPr>
+            <w:r>
+              <w:rPr>
+                <w:sz w:val="24"/>
+              </w:rPr>
               <w:t>0.960</w:t>
             </w:r>
           </w:p>
         </w:tc>
         <w:tc>
           <w:tcPr>
-            <w:tcW w:w="0" w:type="auto"/>
+            <w:tcW w:w="936" w:type="dxa"/>
+            <w:vAlign w:val="center"/>
           </w:tcPr>
           <w:p>
             <w:pPr>
               <w:pStyle w:val="Compact"/>
               <w:jc w:val="right"/>
-            </w:pPr>
-            <w:r>
+              <w:rPr>
+                <w:sz w:val="24"/>
+              </w:rPr>
+            </w:pPr>
+            <w:r>
+              <w:rPr>
+                <w:sz w:val="24"/>
+              </w:rPr>
               <w:t>185146</w:t>
             </w:r>
           </w:p>
         </w:tc>
         <w:tc>
           <w:tcPr>
-            <w:tcW w:w="0" w:type="auto"/>
+            <w:tcW w:w="816" w:type="dxa"/>
+            <w:vAlign w:val="center"/>
           </w:tcPr>
           <w:p>
             <w:pPr>
               <w:pStyle w:val="Compact"/>
               <w:jc w:val="right"/>
-            </w:pPr>
-            <w:r>
+              <w:rPr>
+                <w:sz w:val="24"/>
+              </w:rPr>
+            </w:pPr>
+            <w:r>
+              <w:rPr>
+                <w:sz w:val="24"/>
+              </w:rPr>
               <w:t>69590</w:t>
             </w:r>
           </w:p>
         </w:tc>
         <w:tc>
           <w:tcPr>
-            <w:tcW w:w="0" w:type="auto"/>
+            <w:tcW w:w="803" w:type="dxa"/>
+            <w:vAlign w:val="center"/>
           </w:tcPr>
           <w:p>
             <w:pPr>
               <w:pStyle w:val="Compact"/>
               <w:jc w:val="right"/>
-            </w:pPr>
-            <w:r>
+              <w:rPr>
+                <w:sz w:val="24"/>
+              </w:rPr>
+            </w:pPr>
+            <w:r>
+              <w:rPr>
+                <w:sz w:val="24"/>
+              </w:rPr>
               <w:t>0.665</w:t>
             </w:r>
           </w:p>
         </w:tc>
         <w:tc>
           <w:tcPr>
-            <w:tcW w:w="0" w:type="auto"/>
+            <w:tcW w:w="936" w:type="dxa"/>
+            <w:vAlign w:val="center"/>
           </w:tcPr>
           <w:p>
             <w:pPr>
               <w:pStyle w:val="Compact"/>
               <w:jc w:val="right"/>
-            </w:pPr>
-            <w:r>
+              <w:rPr>
+                <w:sz w:val="24"/>
+              </w:rPr>
+            </w:pPr>
+            <w:r>
+              <w:rPr>
+                <w:sz w:val="24"/>
+              </w:rPr>
               <w:t>105188</w:t>
             </w:r>
           </w:p>
@@ -1077,111 +1384,167 @@
       <w:tr>
         <w:tc>
           <w:tcPr>
-            <w:tcW w:w="0" w:type="auto"/>
-          </w:tcPr>
-          <w:p>
-            <w:pPr>
-              <w:pStyle w:val="Compact"/>
-            </w:pPr>
-            <w:r>
+            <w:tcW w:w="950" w:type="dxa"/>
+            <w:vAlign w:val="center"/>
+          </w:tcPr>
+          <w:p>
+            <w:pPr>
+              <w:pStyle w:val="Compact"/>
+              <w:rPr>
+                <w:sz w:val="24"/>
+              </w:rPr>
+            </w:pPr>
+            <w:r>
+              <w:rPr>
+                <w:sz w:val="24"/>
+              </w:rPr>
               <w:t>Median</w:t>
             </w:r>
           </w:p>
         </w:tc>
         <w:tc>
           <w:tcPr>
-            <w:tcW w:w="0" w:type="auto"/>
+            <w:tcW w:w="790" w:type="dxa"/>
+            <w:vAlign w:val="center"/>
           </w:tcPr>
           <w:p>
             <w:pPr>
               <w:pStyle w:val="Compact"/>
               <w:jc w:val="right"/>
-            </w:pPr>
-            <w:r>
+              <w:rPr>
+                <w:sz w:val="24"/>
+              </w:rPr>
+            </w:pPr>
+            <w:r>
+              <w:rPr>
+                <w:sz w:val="24"/>
+              </w:rPr>
               <w:t>5.910</w:t>
             </w:r>
           </w:p>
         </w:tc>
         <w:tc>
           <w:tcPr>
-            <w:tcW w:w="0" w:type="auto"/>
+            <w:tcW w:w="990" w:type="dxa"/>
+            <w:vAlign w:val="center"/>
           </w:tcPr>
           <w:p>
             <w:pPr>
               <w:pStyle w:val="Compact"/>
               <w:jc w:val="right"/>
-            </w:pPr>
-            <w:r>
+              <w:rPr>
+                <w:sz w:val="24"/>
+              </w:rPr>
+            </w:pPr>
+            <w:r>
+              <w:rPr>
+                <w:sz w:val="24"/>
+              </w:rPr>
               <w:t>1.777</w:t>
             </w:r>
           </w:p>
         </w:tc>
         <w:tc>
           <w:tcPr>
-            <w:tcW w:w="0" w:type="auto"/>
+            <w:tcW w:w="756" w:type="dxa"/>
+            <w:vAlign w:val="center"/>
           </w:tcPr>
           <w:p>
             <w:pPr>
               <w:pStyle w:val="Compact"/>
               <w:jc w:val="right"/>
-            </w:pPr>
-            <w:r>
+              <w:rPr>
+                <w:sz w:val="24"/>
+              </w:rPr>
+            </w:pPr>
+            <w:r>
+              <w:rPr>
+                <w:sz w:val="24"/>
+              </w:rPr>
               <w:t>0.958</w:t>
             </w:r>
           </w:p>
         </w:tc>
         <w:tc>
           <w:tcPr>
-            <w:tcW w:w="0" w:type="auto"/>
+            <w:tcW w:w="936" w:type="dxa"/>
+            <w:vAlign w:val="center"/>
           </w:tcPr>
           <w:p>
             <w:pPr>
               <w:pStyle w:val="Compact"/>
               <w:jc w:val="right"/>
-            </w:pPr>
-            <w:r>
+              <w:rPr>
+                <w:sz w:val="24"/>
+              </w:rPr>
+            </w:pPr>
+            <w:r>
+              <w:rPr>
+                <w:sz w:val="24"/>
+              </w:rPr>
               <w:t>184789</w:t>
             </w:r>
           </w:p>
         </w:tc>
         <w:tc>
           <w:tcPr>
-            <w:tcW w:w="0" w:type="auto"/>
+            <w:tcW w:w="816" w:type="dxa"/>
+            <w:vAlign w:val="center"/>
           </w:tcPr>
           <w:p>
             <w:pPr>
               <w:pStyle w:val="Compact"/>
               <w:jc w:val="right"/>
-            </w:pPr>
-            <w:r>
+              <w:rPr>
+                <w:sz w:val="24"/>
+              </w:rPr>
+            </w:pPr>
+            <w:r>
+              <w:rPr>
+                <w:sz w:val="24"/>
+              </w:rPr>
               <w:t>69440</w:t>
             </w:r>
           </w:p>
         </w:tc>
         <w:tc>
           <w:tcPr>
-            <w:tcW w:w="0" w:type="auto"/>
+            <w:tcW w:w="803" w:type="dxa"/>
+            <w:vAlign w:val="center"/>
           </w:tcPr>
           <w:p>
             <w:pPr>
               <w:pStyle w:val="Compact"/>
               <w:jc w:val="right"/>
-            </w:pPr>
-            <w:r>
+              <w:rPr>
+                <w:sz w:val="24"/>
+              </w:rPr>
+            </w:pPr>
+            <w:r>
+              <w:rPr>
+                <w:sz w:val="24"/>
+              </w:rPr>
               <w:t>0.667</w:t>
             </w:r>
           </w:p>
         </w:tc>
         <w:tc>
           <w:tcPr>
-            <w:tcW w:w="0" w:type="auto"/>
+            <w:tcW w:w="936" w:type="dxa"/>
+            <w:vAlign w:val="center"/>
           </w:tcPr>
           <w:p>
             <w:pPr>
               <w:pStyle w:val="Compact"/>
               <w:jc w:val="right"/>
-            </w:pPr>
-            <w:r>
+              <w:rPr>
+                <w:sz w:val="24"/>
+              </w:rPr>
+            </w:pPr>
+            <w:r>
+              <w:rPr>
+                <w:sz w:val="24"/>
+              </w:rPr>
               <w:t>104342</w:t>
             </w:r>
           </w:p>
@@ -1190,111 +1553,167 @@
       <w:tr>
         <w:tc>
           <w:tcPr>
-            <w:tcW w:w="0" w:type="auto"/>
-          </w:tcPr>
-          <w:p>
-            <w:pPr>
-              <w:pStyle w:val="Compact"/>
-            </w:pPr>
-            <w:r>
+            <w:tcW w:w="950" w:type="dxa"/>
+            <w:vAlign w:val="center"/>
+          </w:tcPr>
+          <w:p>
+            <w:pPr>
+              <w:pStyle w:val="Compact"/>
+              <w:rPr>
+                <w:sz w:val="24"/>
+              </w:rPr>
+            </w:pPr>
+            <w:r>
+              <w:rPr>
+                <w:sz w:val="24"/>
+              </w:rPr>
               <w:t>95%</w:t>
             </w:r>
           </w:p>
         </w:tc>
         <w:tc>
           <w:tcPr>
-            <w:tcW w:w="0" w:type="auto"/>
+            <w:tcW w:w="790" w:type="dxa"/>
+            <w:vAlign w:val="center"/>
           </w:tcPr>
           <w:p>
             <w:pPr>
               <w:pStyle w:val="Compact"/>
               <w:jc w:val="right"/>
-            </w:pPr>
-            <w:r>
+              <w:rPr>
+                <w:sz w:val="24"/>
+              </w:rPr>
+            </w:pPr>
+            <w:r>
+              <w:rPr>
+                <w:sz w:val="24"/>
+              </w:rPr>
               <w:t>7.576</w:t>
             </w:r>
           </w:p>
         </w:tc>
         <w:tc>
           <w:tcPr>
-            <w:tcW w:w="0" w:type="auto"/>
+            <w:tcW w:w="990" w:type="dxa"/>
+            <w:vAlign w:val="center"/>
           </w:tcPr>
           <w:p>
             <w:pPr>
               <w:pStyle w:val="Compact"/>
               <w:jc w:val="right"/>
-            </w:pPr>
-            <w:r>
+              <w:rPr>
+                <w:sz w:val="24"/>
+              </w:rPr>
+            </w:pPr>
+            <w:r>
+              <w:rPr>
+                <w:sz w:val="24"/>
+              </w:rPr>
               <w:t>2.025</w:t>
             </w:r>
           </w:p>
         </w:tc>
         <w:tc>
           <w:tcPr>
-            <w:tcW w:w="0" w:type="auto"/>
+            <w:tcW w:w="756" w:type="dxa"/>
+            <w:vAlign w:val="center"/>
           </w:tcPr>
           <w:p>
             <w:pPr>
               <w:pStyle w:val="Compact"/>
               <w:jc w:val="right"/>
-            </w:pPr>
-            <w:r>
+              <w:rPr>
+                <w:sz w:val="24"/>
+              </w:rPr>
+            </w:pPr>
+            <w:r>
+              <w:rPr>
+                <w:sz w:val="24"/>
+              </w:rPr>
               <w:t>1.124</w:t>
             </w:r>
           </w:p>
         </w:tc>
         <w:tc>
           <w:tcPr>
-            <w:tcW w:w="0" w:type="auto"/>
+            <w:tcW w:w="936" w:type="dxa"/>
+            <w:vAlign w:val="center"/>
           </w:tcPr>
           <w:p>
             <w:pPr>
               <w:pStyle w:val="Compact"/>
               <w:jc w:val="right"/>
-            </w:pPr>
-            <w:r>
+              <w:rPr>
+                <w:sz w:val="24"/>
+              </w:rPr>
+            </w:pPr>
+            <w:r>
+              <w:rPr>
+                <w:sz w:val="24"/>
+              </w:rPr>
               <w:t>200817</w:t>
             </w:r>
           </w:p>
         </w:tc>
         <w:tc>
           <w:tcPr>
-            <w:tcW w:w="0" w:type="auto"/>
+            <w:tcW w:w="816" w:type="dxa"/>
+            <w:vAlign w:val="center"/>
           </w:tcPr>
           <w:p>
             <w:pPr>
               <w:pStyle w:val="Compact"/>
               <w:jc w:val="right"/>
-            </w:pPr>
-            <w:r>
+              <w:rPr>
+                <w:sz w:val="24"/>
+              </w:rPr>
+            </w:pPr>
+            <w:r>
+              <w:rPr>
+                <w:sz w:val="24"/>
+              </w:rPr>
               <w:t>76790</w:t>
             </w:r>
           </w:p>
         </w:tc>
         <w:tc>
           <w:tcPr>
-            <w:tcW w:w="0" w:type="auto"/>
+            <w:tcW w:w="803" w:type="dxa"/>
+            <w:vAlign w:val="center"/>
           </w:tcPr>
           <w:p>
             <w:pPr>
               <w:pStyle w:val="Compact"/>
               <w:jc w:val="right"/>
-            </w:pPr>
-            <w:r>
+              <w:rPr>
+                <w:sz w:val="24"/>
+              </w:rPr>
+            </w:pPr>
+            <w:r>
+              <w:rPr>
+                <w:sz w:val="24"/>
+              </w:rPr>
               <w:t>0.725</w:t>
             </w:r>
           </w:p>
         </w:tc>
         <w:tc>
           <w:tcPr>
-            <w:tcW w:w="0" w:type="auto"/>
+            <w:tcW w:w="936" w:type="dxa"/>
+            <w:vAlign w:val="center"/>
           </w:tcPr>
           <w:p>
             <w:pPr>
               <w:pStyle w:val="Compact"/>
               <w:jc w:val="right"/>
-            </w:pPr>
-            <w:r>
+              <w:rPr>
+                <w:sz w:val="24"/>
+              </w:rPr>
+            </w:pPr>
+            <w:r>
+              <w:rPr>
+                <w:sz w:val="24"/>
+              </w:rPr>
               <w:t>124864</w:t>
             </w:r>
           </w:p>
@@ -1303,111 +1722,167 @@
       <w:tr>
         <w:tc>
           <w:tcPr>
-            <w:tcW w:w="0" w:type="auto"/>
-          </w:tcPr>
-          <w:p>
-            <w:pPr>
-              <w:pStyle w:val="Compact"/>
-            </w:pPr>
-            <w:r>
+            <w:tcW w:w="950" w:type="dxa"/>
+            <w:vAlign w:val="center"/>
+          </w:tcPr>
+          <w:p>
+            <w:pPr>
+              <w:pStyle w:val="Compact"/>
+              <w:rPr>
+                <w:sz w:val="24"/>
+              </w:rPr>
+            </w:pPr>
+            <w:r>
+              <w:rPr>
+                <w:sz w:val="24"/>
+              </w:rPr>
               <w:t>Max</w:t>
             </w:r>
           </w:p>
         </w:tc>
         <w:tc>
           <w:tcPr>
-            <w:tcW w:w="0" w:type="auto"/>
+            <w:tcW w:w="790" w:type="dxa"/>
+            <w:vAlign w:val="center"/>
           </w:tcPr>
           <w:p>
             <w:pPr>
               <w:pStyle w:val="Compact"/>
               <w:jc w:val="right"/>
-            </w:pPr>
-            <w:r>
+              <w:rPr>
+                <w:sz w:val="24"/>
+              </w:rPr>
+            </w:pPr>
+            <w:r>
+              <w:rPr>
+                <w:sz w:val="24"/>
+              </w:rPr>
               <w:t>8.551</w:t>
             </w:r>
           </w:p>
         </w:tc>
         <w:tc>
           <w:tcPr>
-            <w:tcW w:w="0" w:type="auto"/>
+            <w:tcW w:w="990" w:type="dxa"/>
+            <w:vAlign w:val="center"/>
           </w:tcPr>
           <w:p>
             <w:pPr>
               <w:pStyle w:val="Compact"/>
               <w:jc w:val="right"/>
-            </w:pPr>
-            <w:r>
+              <w:rPr>
+                <w:sz w:val="24"/>
+              </w:rPr>
+            </w:pPr>
+            <w:r>
+              <w:rPr>
+                <w:sz w:val="24"/>
+              </w:rPr>
               <w:t>2.146</w:t>
             </w:r>
           </w:p>
         </w:tc>
         <w:tc>
           <w:tcPr>
-            <w:tcW w:w="0" w:type="auto"/>
+            <w:tcW w:w="756" w:type="dxa"/>
+            <w:vAlign w:val="center"/>
           </w:tcPr>
           <w:p>
             <w:pPr>
               <w:pStyle w:val="Compact"/>
               <w:jc w:val="right"/>
-            </w:pPr>
-            <w:r>
+              <w:rPr>
+                <w:sz w:val="24"/>
+              </w:rPr>
+            </w:pPr>
+            <w:r>
+              <w:rPr>
+                <w:sz w:val="24"/>
+              </w:rPr>
               <w:t>1.248</w:t>
             </w:r>
           </w:p>
         </w:tc>
         <w:tc>
           <w:tcPr>
-            <w:tcW w:w="0" w:type="auto"/>
+            <w:tcW w:w="936" w:type="dxa"/>
+            <w:vAlign w:val="center"/>
           </w:tcPr>
           <w:p>
             <w:pPr>
               <w:pStyle w:val="Compact"/>
               <w:jc w:val="right"/>
-            </w:pPr>
-            <w:r>
+              <w:rPr>
+                <w:sz w:val="24"/>
+              </w:rPr>
+            </w:pPr>
+            <w:r>
+              <w:rPr>
+                <w:sz w:val="24"/>
+              </w:rPr>
               <w:t>210397</w:t>
             </w:r>
           </w:p>
         </w:tc>
         <w:tc>
           <w:tcPr>
-            <w:tcW w:w="0" w:type="auto"/>
+            <w:tcW w:w="816" w:type="dxa"/>
+            <w:vAlign w:val="center"/>
           </w:tcPr>
           <w:p>
             <w:pPr>
               <w:pStyle w:val="Compact"/>
               <w:jc w:val="right"/>
-            </w:pPr>
-            <w:r>
+              <w:rPr>
+                <w:sz w:val="24"/>
+              </w:rPr>
+            </w:pPr>
+            <w:r>
+              <w:rPr>
+                <w:sz w:val="24"/>
+              </w:rPr>
               <w:t>81788</w:t>
             </w:r>
           </w:p>
         </w:tc>
         <w:tc>
           <w:tcPr>
-            <w:tcW w:w="0" w:type="auto"/>
+            <w:tcW w:w="803" w:type="dxa"/>
+            <w:vAlign w:val="center"/>
           </w:tcPr>
           <w:p>
             <w:pPr>
               <w:pStyle w:val="Compact"/>
               <w:jc w:val="right"/>
-            </w:pPr>
-            <w:r>
+              <w:rPr>
+                <w:sz w:val="24"/>
+              </w:rPr>
+            </w:pPr>
+            <w:r>
+              <w:rPr>
+                <w:sz w:val="24"/>
+              </w:rPr>
               <w:t>0.751</w:t>
             </w:r>
           </w:p>
         </w:tc>
         <w:tc>
           <w:tcPr>
-            <w:tcW w:w="0" w:type="auto"/>
+            <w:tcW w:w="936" w:type="dxa"/>
+            <w:vAlign w:val="center"/>
           </w:tcPr>
           <w:p>
             <w:pPr>
               <w:pStyle w:val="Compact"/>
               <w:jc w:val="right"/>
-            </w:pPr>
-            <w:r>
+              <w:rPr>
+                <w:sz w:val="24"/>
+              </w:rPr>
+            </w:pPr>
+            <w:r>
+              <w:rPr>
+                <w:sz w:val="24"/>
+              </w:rPr>
               <w:t>135146</w:t>
             </w:r>
           </w:p>
@@ -1416,135 +1891,191 @@
       <w:tr>
         <w:tc>
           <w:tcPr>
-            <w:tcW w:w="0" w:type="auto"/>
+            <w:tcW w:w="950" w:type="dxa"/>
             <w:tcBorders>
               <w:bottom w:val="single" w:sz="4" w:space="0" w:color="auto"/>
             </w:tcBorders>
-          </w:tcPr>
-          <w:p>
-            <w:pPr>
-              <w:pStyle w:val="Compact"/>
-            </w:pPr>
-            <w:r>
+            <w:vAlign w:val="center"/>
+          </w:tcPr>
+          <w:p>
+            <w:pPr>
+              <w:pStyle w:val="Compact"/>
+              <w:rPr>
+                <w:sz w:val="24"/>
+              </w:rPr>
+            </w:pPr>
+            <w:r>
+              <w:rPr>
+                <w:sz w:val="24"/>
+              </w:rPr>
               <w:t>SD</w:t>
             </w:r>
           </w:p>
         </w:tc>
         <w:tc>
           <w:tcPr>
-            <w:tcW w:w="0" w:type="auto"/>
+            <w:tcW w:w="790" w:type="dxa"/>
             <w:tcBorders>
               <w:bottom w:val="single" w:sz="4" w:space="0" w:color="auto"/>
             </w:tcBorders>
+            <w:vAlign w:val="center"/>
           </w:tcPr>
           <w:p>
             <w:pPr>
               <w:pStyle w:val="Compact"/>
               <w:jc w:val="right"/>
-            </w:pPr>
-            <w:r>
+              <w:rPr>
+                <w:sz w:val="24"/>
+              </w:rPr>
+            </w:pPr>
+            <w:r>
+              <w:rPr>
+                <w:sz w:val="24"/>
+              </w:rPr>
               <w:t>0.906</w:t>
             </w:r>
           </w:p>
         </w:tc>
         <w:tc>
           <w:tcPr>
-            <w:tcW w:w="0" w:type="auto"/>
+            <w:tcW w:w="990" w:type="dxa"/>
             <w:tcBorders>
               <w:bottom w:val="single" w:sz="4" w:space="0" w:color="auto"/>
             </w:tcBorders>
+            <w:vAlign w:val="center"/>
           </w:tcPr>
           <w:p>
             <w:pPr>
               <w:pStyle w:val="Compact"/>
               <w:jc w:val="right"/>
-            </w:pPr>
-            <w:r>
+              <w:rPr>
+                <w:sz w:val="24"/>
+              </w:rPr>
+            </w:pPr>
+            <w:r>
+              <w:rPr>
+                <w:sz w:val="24"/>
+              </w:rPr>
               <w:t>0.152</w:t>
             </w:r>
           </w:p>
         </w:tc>
         <w:tc>
           <w:tcPr>
-            <w:tcW w:w="0" w:type="auto"/>
+            <w:tcW w:w="756" w:type="dxa"/>
             <w:tcBorders>
               <w:bottom w:val="single" w:sz="4" w:space="0" w:color="auto"/>
             </w:tcBorders>
+            <w:vAlign w:val="center"/>
           </w:tcPr>
           <w:p>
             <w:pPr>
               <w:pStyle w:val="Compact"/>
               <w:jc w:val="right"/>
-            </w:pPr>
-            <w:r>
+              <w:rPr>
+                <w:sz w:val="24"/>
+              </w:rPr>
+            </w:pPr>
+            <w:r>
+              <w:rPr>
+                <w:sz w:val="24"/>
+              </w:rPr>
               <w:t>0.097</w:t>
             </w:r>
           </w:p>
         </w:tc>
         <w:tc>
           <w:tcPr>
-            <w:tcW w:w="0" w:type="auto"/>
+            <w:tcW w:w="936" w:type="dxa"/>
             <w:tcBorders>
               <w:bottom w:val="single" w:sz="4" w:space="0" w:color="auto"/>
             </w:tcBorders>
+            <w:vAlign w:val="center"/>
           </w:tcPr>
           <w:p>
             <w:pPr>
               <w:pStyle w:val="Compact"/>
               <w:jc w:val="right"/>
-            </w:pPr>
-            <w:r>
+              <w:rPr>
+                <w:sz w:val="24"/>
+              </w:rPr>
+            </w:pPr>
+            <w:r>
+              <w:rPr>
+                <w:sz w:val="24"/>
+              </w:rPr>
               <w:t>9080</w:t>
             </w:r>
           </w:p>
         </w:tc>
         <w:tc>
           <w:tcPr>
-            <w:tcW w:w="0" w:type="auto"/>
+            <w:tcW w:w="816" w:type="dxa"/>
             <w:tcBorders>
               <w:bottom w:val="single" w:sz="4" w:space="0" w:color="auto"/>
             </w:tcBorders>
+            <w:vAlign w:val="center"/>
           </w:tcPr>
           <w:p>
             <w:pPr>
               <w:pStyle w:val="Compact"/>
               <w:jc w:val="right"/>
-            </w:pPr>
-            <w:r>
+              <w:rPr>
+                <w:sz w:val="24"/>
+              </w:rPr>
+            </w:pPr>
+            <w:r>
+              <w:rPr>
+                <w:sz w:val="24"/>
+              </w:rPr>
               <w:t>4019</w:t>
             </w:r>
           </w:p>
         </w:tc>
         <w:tc>
           <w:tcPr>
-            <w:tcW w:w="0" w:type="auto"/>
+            <w:tcW w:w="803" w:type="dxa"/>
             <w:tcBorders>
               <w:bottom w:val="single" w:sz="4" w:space="0" w:color="auto"/>
             </w:tcBorders>
+            <w:vAlign w:val="center"/>
           </w:tcPr>
           <w:p>
             <w:pPr>
               <w:pStyle w:val="Compact"/>
               <w:jc w:val="right"/>
-            </w:pPr>
-            <w:r>
+              <w:rPr>
+                <w:sz w:val="24"/>
+              </w:rPr>
+            </w:pPr>
+            <w:r>
+              <w:rPr>
+                <w:sz w:val="24"/>
+              </w:rPr>
               <w:t>0.038</w:t>
             </w:r>
           </w:p>
         </w:tc>
         <w:tc>
           <w:tcPr>
-            <w:tcW w:w="0" w:type="auto"/>
+            <w:tcW w:w="936" w:type="dxa"/>
             <w:tcBorders>
               <w:bottom w:val="single" w:sz="4" w:space="0" w:color="auto"/>
             </w:tcBorders>
+            <w:vAlign w:val="center"/>
           </w:tcPr>
           <w:p>
             <w:pPr>
               <w:pStyle w:val="Compact"/>
               <w:jc w:val="right"/>
-            </w:pPr>
-            <w:r>
+              <w:rPr>
+                <w:sz w:val="24"/>
+              </w:rPr>
+            </w:pPr>
+            <w:r>
+              <w:rPr>
+                <w:sz w:val="24"/>
+              </w:rPr>
               <w:t>10720</w:t>
             </w:r>
           </w:p>
@@ -1553,8 +2084,1666 @@
     </w:tbl>
     <w:p>
       <w:pPr>
+        <w:rPr>
+          <w:rFonts w:ascii="Times New Roman" w:hAnsi="Times New Roman" w:cs="Times New Roman"/>
+        </w:rPr>
+      </w:pPr>
+    </w:p>
+    <w:p>
+      <w:pPr>
+        <w:rPr>
+          <w:rFonts w:ascii="Times New Roman" w:hAnsi="Times New Roman" w:cs="Times New Roman"/>
+        </w:rPr>
+      </w:pPr>
+      <w:r>
+        <w:rPr>
+          <w:rFonts w:ascii="Times New Roman" w:hAnsi="Times New Roman" w:cs="Times New Roman"/>
+        </w:rPr>
+        <w:lastRenderedPageBreak/>
+        <w:t xml:space="preserve">Amet nunc eros </w:t>
+      </w:r>
+      <w:proofErr w:type="spellStart"/>
+      <w:r>
+        <w:rPr>
+          <w:rFonts w:ascii="Times New Roman" w:hAnsi="Times New Roman" w:cs="Times New Roman"/>
+        </w:rPr>
+        <w:t>curabitur</w:t>
+      </w:r>
+      <w:proofErr w:type="spellEnd"/>
+      <w:r>
+        <w:rPr>
+          <w:rFonts w:ascii="Times New Roman" w:hAnsi="Times New Roman" w:cs="Times New Roman"/>
+        </w:rPr>
+        <w:t xml:space="preserve"> </w:t>
+      </w:r>
+      <w:proofErr w:type="spellStart"/>
+      <w:r>
+        <w:rPr>
+          <w:rFonts w:ascii="Times New Roman" w:hAnsi="Times New Roman" w:cs="Times New Roman"/>
+        </w:rPr>
+        <w:t>tellus</w:t>
+      </w:r>
+      <w:proofErr w:type="spellEnd"/>
+      <w:r>
+        <w:rPr>
+          <w:rFonts w:ascii="Times New Roman" w:hAnsi="Times New Roman" w:cs="Times New Roman"/>
+        </w:rPr>
+        <w:t xml:space="preserve"> </w:t>
+      </w:r>
+      <w:proofErr w:type="spellStart"/>
+      <w:r>
+        <w:rPr>
+          <w:rFonts w:ascii="Times New Roman" w:hAnsi="Times New Roman" w:cs="Times New Roman"/>
+        </w:rPr>
+        <w:t>massa</w:t>
+      </w:r>
+      <w:proofErr w:type="spellEnd"/>
+      <w:r>
+        <w:rPr>
+          <w:rFonts w:ascii="Times New Roman" w:hAnsi="Times New Roman" w:cs="Times New Roman"/>
+        </w:rPr>
+        <w:t xml:space="preserve">, eros maximus </w:t>
+      </w:r>
+      <w:proofErr w:type="spellStart"/>
+      <w:r>
+        <w:rPr>
+          <w:rFonts w:ascii="Times New Roman" w:hAnsi="Times New Roman" w:cs="Times New Roman"/>
+        </w:rPr>
+        <w:t>porttitor</w:t>
+      </w:r>
+      <w:proofErr w:type="spellEnd"/>
+      <w:r>
+        <w:rPr>
+          <w:rFonts w:ascii="Times New Roman" w:hAnsi="Times New Roman" w:cs="Times New Roman"/>
+        </w:rPr>
+        <w:t xml:space="preserve"> </w:t>
+      </w:r>
+      <w:proofErr w:type="spellStart"/>
+      <w:r>
+        <w:rPr>
+          <w:rFonts w:ascii="Times New Roman" w:hAnsi="Times New Roman" w:cs="Times New Roman"/>
+        </w:rPr>
+        <w:t>sociosqu</w:t>
+      </w:r>
+      <w:proofErr w:type="spellEnd"/>
+      <w:r>
+        <w:rPr>
+          <w:rFonts w:ascii="Times New Roman" w:hAnsi="Times New Roman" w:cs="Times New Roman"/>
+        </w:rPr>
+        <w:t xml:space="preserve">, </w:t>
+      </w:r>
+      <w:proofErr w:type="spellStart"/>
+      <w:r>
+        <w:rPr>
+          <w:rFonts w:ascii="Times New Roman" w:hAnsi="Times New Roman" w:cs="Times New Roman"/>
+        </w:rPr>
+        <w:t>pellentesque</w:t>
+      </w:r>
+      <w:proofErr w:type="spellEnd"/>
+      <w:r>
+        <w:rPr>
+          <w:rFonts w:ascii="Times New Roman" w:hAnsi="Times New Roman" w:cs="Times New Roman"/>
+        </w:rPr>
+        <w:t>.</w:t>
+      </w:r>
+    </w:p>
+    <w:p>
+      <w:pPr>
+        <w:pStyle w:val="Compact"/>
+        <w:numPr>
+          <w:ilvl w:val="0"/>
+          <w:numId w:val="13"/>
+        </w:numPr>
+      </w:pPr>
+      <w:r>
+        <w:t xml:space="preserve">Erat </w:t>
+      </w:r>
+      <w:proofErr w:type="spellStart"/>
+      <w:r>
+        <w:t>mauris</w:t>
+      </w:r>
+      <w:proofErr w:type="spellEnd"/>
+      <w:r>
+        <w:t xml:space="preserve"> </w:t>
+      </w:r>
+      <w:proofErr w:type="spellStart"/>
+      <w:r>
+        <w:t>egestas</w:t>
+      </w:r>
+      <w:proofErr w:type="spellEnd"/>
+      <w:r>
+        <w:t xml:space="preserve"> </w:t>
+      </w:r>
+      <w:proofErr w:type="spellStart"/>
+      <w:r>
+        <w:t>finibus</w:t>
+      </w:r>
+      <w:proofErr w:type="spellEnd"/>
+      <w:r>
+        <w:t xml:space="preserve"> </w:t>
+      </w:r>
+      <w:proofErr w:type="spellStart"/>
+      <w:r>
+        <w:t>tincidunt</w:t>
+      </w:r>
+      <w:proofErr w:type="spellEnd"/>
+      <w:r>
+        <w:t xml:space="preserve"> sed in </w:t>
+      </w:r>
+      <w:proofErr w:type="spellStart"/>
+      <w:r>
+        <w:t>rhoncus</w:t>
+      </w:r>
+      <w:proofErr w:type="spellEnd"/>
+      <w:r>
+        <w:t xml:space="preserve"> a </w:t>
+      </w:r>
+      <w:proofErr w:type="spellStart"/>
+      <w:r>
+        <w:t>tellus</w:t>
+      </w:r>
+      <w:proofErr w:type="spellEnd"/>
+      <w:r>
+        <w:t xml:space="preserve"> </w:t>
+      </w:r>
+      <w:proofErr w:type="spellStart"/>
+      <w:r>
+        <w:t>etiam</w:t>
+      </w:r>
+      <w:proofErr w:type="spellEnd"/>
+      <w:r>
+        <w:t>.</w:t>
+      </w:r>
+    </w:p>
+    <w:p>
+      <w:pPr>
+        <w:pStyle w:val="Compact"/>
+        <w:numPr>
+          <w:ilvl w:val="1"/>
+          <w:numId w:val="13"/>
+        </w:numPr>
+      </w:pPr>
+      <w:proofErr w:type="gramStart"/>
+      <w:r>
+        <w:t>A</w:t>
+      </w:r>
+      <w:proofErr w:type="gramEnd"/>
+      <w:r>
+        <w:t xml:space="preserve"> </w:t>
+      </w:r>
+      <w:proofErr w:type="spellStart"/>
+      <w:r>
+        <w:t>adipiscing</w:t>
+      </w:r>
+      <w:proofErr w:type="spellEnd"/>
+      <w:r>
+        <w:t xml:space="preserve"> per </w:t>
+      </w:r>
+      <w:proofErr w:type="spellStart"/>
+      <w:r>
+        <w:t>ultricies</w:t>
+      </w:r>
+      <w:proofErr w:type="spellEnd"/>
+      <w:r>
+        <w:t xml:space="preserve"> </w:t>
+      </w:r>
+      <w:proofErr w:type="spellStart"/>
+      <w:r>
+        <w:t>justo</w:t>
+      </w:r>
+      <w:proofErr w:type="spellEnd"/>
+      <w:r>
+        <w:t xml:space="preserve"> </w:t>
+      </w:r>
+      <w:proofErr w:type="spellStart"/>
+      <w:r>
+        <w:t>tellus</w:t>
+      </w:r>
+      <w:proofErr w:type="spellEnd"/>
+      <w:r>
+        <w:t xml:space="preserve"> lorem.</w:t>
+      </w:r>
+    </w:p>
+    <w:p>
+      <w:pPr>
+        <w:pStyle w:val="Compact"/>
+        <w:numPr>
+          <w:ilvl w:val="2"/>
+          <w:numId w:val="13"/>
+        </w:numPr>
+      </w:pPr>
+      <w:proofErr w:type="spellStart"/>
+      <w:r>
+        <w:t>Imperdiet</w:t>
+      </w:r>
+      <w:proofErr w:type="spellEnd"/>
+      <w:r>
+        <w:t xml:space="preserve"> </w:t>
+      </w:r>
+      <w:proofErr w:type="spellStart"/>
+      <w:r>
+        <w:t>ut</w:t>
+      </w:r>
+      <w:proofErr w:type="spellEnd"/>
+      <w:r>
+        <w:t xml:space="preserve"> dui </w:t>
+      </w:r>
+      <w:proofErr w:type="spellStart"/>
+      <w:r>
+        <w:t>primis</w:t>
+      </w:r>
+      <w:proofErr w:type="spellEnd"/>
+      <w:r>
+        <w:t xml:space="preserve">, sed gravida, at sed </w:t>
+      </w:r>
+      <w:proofErr w:type="spellStart"/>
+      <w:r>
+        <w:t>nulla</w:t>
+      </w:r>
+      <w:proofErr w:type="spellEnd"/>
+      <w:r>
+        <w:t>.</w:t>
+      </w:r>
+    </w:p>
+    <w:p>
+      <w:pPr>
+        <w:pStyle w:val="Compact"/>
+        <w:numPr>
+          <w:ilvl w:val="2"/>
+          <w:numId w:val="13"/>
+        </w:numPr>
+      </w:pPr>
+      <w:r>
+        <w:t xml:space="preserve">Sem </w:t>
+      </w:r>
+      <w:proofErr w:type="spellStart"/>
+      <w:r>
+        <w:t>posuere</w:t>
+      </w:r>
+      <w:proofErr w:type="spellEnd"/>
+      <w:r>
+        <w:t xml:space="preserve"> </w:t>
+      </w:r>
+      <w:proofErr w:type="spellStart"/>
+      <w:r>
+        <w:t>lacus</w:t>
+      </w:r>
+      <w:proofErr w:type="spellEnd"/>
+      <w:r>
+        <w:t xml:space="preserve"> </w:t>
+      </w:r>
+      <w:proofErr w:type="spellStart"/>
+      <w:r>
+        <w:t>consequat</w:t>
+      </w:r>
+      <w:proofErr w:type="spellEnd"/>
+      <w:r>
+        <w:t xml:space="preserve"> </w:t>
+      </w:r>
+      <w:proofErr w:type="spellStart"/>
+      <w:r>
+        <w:t>inceptos</w:t>
+      </w:r>
+      <w:proofErr w:type="spellEnd"/>
+      <w:r>
+        <w:t xml:space="preserve"> </w:t>
+      </w:r>
+      <w:proofErr w:type="spellStart"/>
+      <w:r>
+        <w:t>dapibus</w:t>
+      </w:r>
+      <w:proofErr w:type="spellEnd"/>
+      <w:r>
+        <w:t xml:space="preserve"> </w:t>
+      </w:r>
+      <w:proofErr w:type="spellStart"/>
+      <w:r>
+        <w:t>duis</w:t>
+      </w:r>
+      <w:proofErr w:type="spellEnd"/>
+      <w:r>
+        <w:t xml:space="preserve"> </w:t>
+      </w:r>
+      <w:proofErr w:type="spellStart"/>
+      <w:r>
+        <w:t>malesuada</w:t>
+      </w:r>
+      <w:proofErr w:type="spellEnd"/>
+      <w:r>
+        <w:t xml:space="preserve"> </w:t>
+      </w:r>
+      <w:proofErr w:type="spellStart"/>
+      <w:r>
+        <w:t>finibus</w:t>
+      </w:r>
+      <w:proofErr w:type="spellEnd"/>
+      <w:r>
+        <w:t>.</w:t>
+      </w:r>
+    </w:p>
+    <w:p>
+      <w:pPr>
+        <w:pStyle w:val="Compact"/>
+        <w:numPr>
+          <w:ilvl w:val="1"/>
+          <w:numId w:val="13"/>
+        </w:numPr>
+      </w:pPr>
+      <w:r>
+        <w:t xml:space="preserve">Urna sed dui, </w:t>
+      </w:r>
+      <w:proofErr w:type="spellStart"/>
+      <w:r>
+        <w:t>ornare</w:t>
+      </w:r>
+      <w:proofErr w:type="spellEnd"/>
+      <w:r>
+        <w:t xml:space="preserve">, </w:t>
+      </w:r>
+      <w:proofErr w:type="spellStart"/>
+      <w:r>
+        <w:t>eu</w:t>
+      </w:r>
+      <w:proofErr w:type="spellEnd"/>
+      <w:r>
+        <w:t xml:space="preserve"> </w:t>
+      </w:r>
+      <w:proofErr w:type="spellStart"/>
+      <w:r>
+        <w:t>turpis</w:t>
+      </w:r>
+      <w:proofErr w:type="spellEnd"/>
+      <w:r>
+        <w:t xml:space="preserve"> </w:t>
+      </w:r>
+      <w:proofErr w:type="spellStart"/>
+      <w:r>
+        <w:t>mus</w:t>
+      </w:r>
+      <w:proofErr w:type="spellEnd"/>
+      <w:r>
+        <w:t xml:space="preserve"> </w:t>
+      </w:r>
+      <w:proofErr w:type="spellStart"/>
+      <w:r>
+        <w:t>pellentesque</w:t>
+      </w:r>
+      <w:proofErr w:type="spellEnd"/>
+      <w:r>
+        <w:t xml:space="preserve"> </w:t>
+      </w:r>
+      <w:proofErr w:type="spellStart"/>
+      <w:r>
+        <w:t>amet</w:t>
+      </w:r>
+      <w:proofErr w:type="spellEnd"/>
+      <w:r>
+        <w:t xml:space="preserve"> </w:t>
+      </w:r>
+      <w:proofErr w:type="spellStart"/>
+      <w:r>
+        <w:t>amet</w:t>
+      </w:r>
+      <w:proofErr w:type="spellEnd"/>
+      <w:r>
+        <w:t xml:space="preserve"> </w:t>
+      </w:r>
+      <w:proofErr w:type="spellStart"/>
+      <w:r>
+        <w:t>bibendum</w:t>
+      </w:r>
+      <w:proofErr w:type="spellEnd"/>
+      <w:r>
+        <w:t>.</w:t>
+      </w:r>
+    </w:p>
+    <w:p>
+      <w:pPr>
+        <w:pStyle w:val="Compact"/>
+        <w:numPr>
+          <w:ilvl w:val="0"/>
+          <w:numId w:val="13"/>
+        </w:numPr>
+      </w:pPr>
+      <w:proofErr w:type="spellStart"/>
+      <w:r>
+        <w:t>Himenaeos</w:t>
+      </w:r>
+      <w:proofErr w:type="spellEnd"/>
+      <w:r>
+        <w:t xml:space="preserve"> </w:t>
+      </w:r>
+      <w:proofErr w:type="spellStart"/>
+      <w:r>
+        <w:t>tincidunt</w:t>
+      </w:r>
+      <w:proofErr w:type="spellEnd"/>
+      <w:r>
+        <w:t xml:space="preserve">, auctor </w:t>
+      </w:r>
+      <w:proofErr w:type="spellStart"/>
+      <w:r>
+        <w:t>dapibus</w:t>
+      </w:r>
+      <w:proofErr w:type="spellEnd"/>
+      <w:r>
+        <w:t xml:space="preserve"> </w:t>
+      </w:r>
+      <w:proofErr w:type="spellStart"/>
+      <w:r>
+        <w:t>scelerisque</w:t>
+      </w:r>
+      <w:proofErr w:type="spellEnd"/>
+      <w:r>
+        <w:t xml:space="preserve">, </w:t>
+      </w:r>
+      <w:proofErr w:type="spellStart"/>
+      <w:r>
+        <w:t>montes</w:t>
+      </w:r>
+      <w:proofErr w:type="spellEnd"/>
+      <w:r>
+        <w:t xml:space="preserve"> nunc </w:t>
+      </w:r>
+      <w:proofErr w:type="spellStart"/>
+      <w:r>
+        <w:t>faucibus</w:t>
+      </w:r>
+      <w:proofErr w:type="spellEnd"/>
+      <w:r>
+        <w:t xml:space="preserve"> </w:t>
+      </w:r>
+      <w:proofErr w:type="spellStart"/>
+      <w:r>
+        <w:t>sodales</w:t>
+      </w:r>
+      <w:proofErr w:type="spellEnd"/>
+      <w:r>
+        <w:t xml:space="preserve"> </w:t>
+      </w:r>
+      <w:proofErr w:type="spellStart"/>
+      <w:r>
+        <w:t>malesuada</w:t>
+      </w:r>
+      <w:proofErr w:type="spellEnd"/>
+      <w:r>
+        <w:t xml:space="preserve"> </w:t>
+      </w:r>
+      <w:proofErr w:type="spellStart"/>
+      <w:r>
+        <w:t>ridiculus</w:t>
+      </w:r>
+      <w:proofErr w:type="spellEnd"/>
+      <w:r>
+        <w:t xml:space="preserve"> sed </w:t>
+      </w:r>
+      <w:proofErr w:type="spellStart"/>
+      <w:r>
+        <w:t>cubilia</w:t>
+      </w:r>
+      <w:proofErr w:type="spellEnd"/>
+      <w:r>
+        <w:t xml:space="preserve"> ligula.</w:t>
+      </w:r>
+    </w:p>
+    <w:p>
+      <w:pPr>
+        <w:pStyle w:val="Compact"/>
+        <w:numPr>
+          <w:ilvl w:val="0"/>
+          <w:numId w:val="14"/>
+        </w:numPr>
+      </w:pPr>
+      <w:r>
+        <w:t xml:space="preserve">Erat </w:t>
+      </w:r>
+      <w:proofErr w:type="spellStart"/>
+      <w:r>
+        <w:t>mauris</w:t>
+      </w:r>
+      <w:proofErr w:type="spellEnd"/>
+      <w:r>
+        <w:t xml:space="preserve"> </w:t>
+      </w:r>
+      <w:proofErr w:type="spellStart"/>
+      <w:r>
+        <w:t>egestas</w:t>
+      </w:r>
+      <w:proofErr w:type="spellEnd"/>
+      <w:r>
+        <w:t xml:space="preserve"> </w:t>
+      </w:r>
+      <w:proofErr w:type="spellStart"/>
+      <w:r>
+        <w:t>finibus</w:t>
+      </w:r>
+      <w:proofErr w:type="spellEnd"/>
+      <w:r>
+        <w:t xml:space="preserve"> </w:t>
+      </w:r>
+      <w:proofErr w:type="spellStart"/>
+      <w:r>
+        <w:t>tincidunt</w:t>
+      </w:r>
+      <w:proofErr w:type="spellEnd"/>
+      <w:r>
+        <w:t xml:space="preserve"> sed in </w:t>
+      </w:r>
+      <w:proofErr w:type="spellStart"/>
+      <w:r>
+        <w:t>rhoncus</w:t>
+      </w:r>
+      <w:proofErr w:type="spellEnd"/>
+      <w:r>
+        <w:t xml:space="preserve"> a </w:t>
+      </w:r>
+      <w:proofErr w:type="spellStart"/>
+      <w:r>
+        <w:t>tellus</w:t>
+      </w:r>
+      <w:proofErr w:type="spellEnd"/>
+      <w:r>
+        <w:t xml:space="preserve"> </w:t>
+      </w:r>
+      <w:proofErr w:type="spellStart"/>
+      <w:r>
+        <w:t>etiam</w:t>
+      </w:r>
+      <w:proofErr w:type="spellEnd"/>
+      <w:r>
+        <w:t>.</w:t>
+      </w:r>
+    </w:p>
+    <w:p>
+      <w:pPr>
+        <w:pStyle w:val="Compact"/>
+        <w:numPr>
+          <w:ilvl w:val="1"/>
+          <w:numId w:val="15"/>
+        </w:numPr>
+      </w:pPr>
+      <w:proofErr w:type="gramStart"/>
+      <w:r>
+        <w:t>A</w:t>
+      </w:r>
+      <w:proofErr w:type="gramEnd"/>
+      <w:r>
+        <w:t xml:space="preserve"> </w:t>
+      </w:r>
+      <w:proofErr w:type="spellStart"/>
+      <w:r>
+        <w:t>adipiscing</w:t>
+      </w:r>
+      <w:proofErr w:type="spellEnd"/>
+      <w:r>
+        <w:t xml:space="preserve"> per </w:t>
+      </w:r>
+      <w:proofErr w:type="spellStart"/>
+      <w:r>
+        <w:t>ultricies</w:t>
+      </w:r>
+      <w:proofErr w:type="spellEnd"/>
+      <w:r>
+        <w:t xml:space="preserve"> </w:t>
+      </w:r>
+      <w:proofErr w:type="spellStart"/>
+      <w:r>
+        <w:t>justo</w:t>
+      </w:r>
+      <w:proofErr w:type="spellEnd"/>
+      <w:r>
+        <w:t xml:space="preserve"> </w:t>
+      </w:r>
+      <w:proofErr w:type="spellStart"/>
+      <w:r>
+        <w:t>tellus</w:t>
+      </w:r>
+      <w:proofErr w:type="spellEnd"/>
+      <w:r>
+        <w:t xml:space="preserve"> lorem.</w:t>
+      </w:r>
+    </w:p>
+    <w:p>
+      <w:pPr>
+        <w:pStyle w:val="Compact"/>
+        <w:numPr>
+          <w:ilvl w:val="2"/>
+          <w:numId w:val="16"/>
+        </w:numPr>
+      </w:pPr>
+      <w:proofErr w:type="spellStart"/>
+      <w:r>
+        <w:t>Imperdiet</w:t>
+      </w:r>
+      <w:proofErr w:type="spellEnd"/>
+      <w:r>
+        <w:t xml:space="preserve"> </w:t>
+      </w:r>
+      <w:proofErr w:type="spellStart"/>
+      <w:r>
+        <w:t>ut</w:t>
+      </w:r>
+      <w:proofErr w:type="spellEnd"/>
+      <w:r>
+        <w:t xml:space="preserve"> dui </w:t>
+      </w:r>
+      <w:proofErr w:type="spellStart"/>
+      <w:r>
+        <w:t>primis</w:t>
+      </w:r>
+      <w:proofErr w:type="spellEnd"/>
+      <w:r>
+        <w:t xml:space="preserve">, sed gravida, at sed </w:t>
+      </w:r>
+      <w:proofErr w:type="spellStart"/>
+      <w:r>
+        <w:t>nulla</w:t>
+      </w:r>
+      <w:proofErr w:type="spellEnd"/>
+      <w:r>
+        <w:t>.</w:t>
+      </w:r>
+    </w:p>
+    <w:p>
+      <w:pPr>
+        <w:pStyle w:val="Compact"/>
+        <w:numPr>
+          <w:ilvl w:val="2"/>
+          <w:numId w:val="16"/>
+        </w:numPr>
+      </w:pPr>
+      <w:r>
+        <w:t xml:space="preserve">Sem </w:t>
+      </w:r>
+      <w:proofErr w:type="spellStart"/>
+      <w:r>
+        <w:t>posuere</w:t>
+      </w:r>
+      <w:proofErr w:type="spellEnd"/>
+      <w:r>
+        <w:t xml:space="preserve"> </w:t>
+      </w:r>
+      <w:proofErr w:type="spellStart"/>
+      <w:r>
+        <w:t>lacus</w:t>
+      </w:r>
+      <w:proofErr w:type="spellEnd"/>
+      <w:r>
+        <w:t xml:space="preserve"> </w:t>
+      </w:r>
+      <w:proofErr w:type="spellStart"/>
+      <w:r>
+        <w:t>consequat</w:t>
+      </w:r>
+      <w:proofErr w:type="spellEnd"/>
+      <w:r>
+        <w:t xml:space="preserve"> </w:t>
+      </w:r>
+      <w:proofErr w:type="spellStart"/>
+      <w:r>
+        <w:t>inceptos</w:t>
+      </w:r>
+      <w:proofErr w:type="spellEnd"/>
+      <w:r>
+        <w:t xml:space="preserve"> </w:t>
+      </w:r>
+      <w:proofErr w:type="spellStart"/>
+      <w:r>
+        <w:t>dapibus</w:t>
+      </w:r>
+      <w:proofErr w:type="spellEnd"/>
+      <w:r>
+        <w:t xml:space="preserve"> </w:t>
+      </w:r>
+      <w:proofErr w:type="spellStart"/>
+      <w:r>
+        <w:t>duis</w:t>
+      </w:r>
+      <w:proofErr w:type="spellEnd"/>
+      <w:r>
+        <w:t xml:space="preserve"> </w:t>
+      </w:r>
+      <w:proofErr w:type="spellStart"/>
+      <w:r>
+        <w:t>malesuada</w:t>
+      </w:r>
+      <w:proofErr w:type="spellEnd"/>
+      <w:r>
+        <w:t xml:space="preserve"> </w:t>
+      </w:r>
+      <w:proofErr w:type="spellStart"/>
+      <w:r>
+        <w:t>finibus</w:t>
+      </w:r>
+      <w:proofErr w:type="spellEnd"/>
+      <w:r>
+        <w:t>.</w:t>
+      </w:r>
+    </w:p>
+    <w:p>
+      <w:pPr>
+        <w:pStyle w:val="Compact"/>
+        <w:numPr>
+          <w:ilvl w:val="1"/>
+          <w:numId w:val="15"/>
+        </w:numPr>
+      </w:pPr>
+      <w:r>
+        <w:t xml:space="preserve">Urna sed dui, </w:t>
+      </w:r>
+      <w:proofErr w:type="spellStart"/>
+      <w:r>
+        <w:t>ornare</w:t>
+      </w:r>
+      <w:proofErr w:type="spellEnd"/>
+      <w:r>
+        <w:t xml:space="preserve">, </w:t>
+      </w:r>
+      <w:proofErr w:type="spellStart"/>
+      <w:r>
+        <w:t>eu</w:t>
+      </w:r>
+      <w:proofErr w:type="spellEnd"/>
+      <w:r>
+        <w:t xml:space="preserve"> </w:t>
+      </w:r>
+      <w:proofErr w:type="spellStart"/>
+      <w:r>
+        <w:t>turpis</w:t>
+      </w:r>
+      <w:proofErr w:type="spellEnd"/>
+      <w:r>
+        <w:t xml:space="preserve"> </w:t>
+      </w:r>
+      <w:proofErr w:type="spellStart"/>
+      <w:r>
+        <w:t>mus</w:t>
+      </w:r>
+      <w:proofErr w:type="spellEnd"/>
+      <w:r>
+        <w:t xml:space="preserve"> </w:t>
+      </w:r>
+      <w:proofErr w:type="spellStart"/>
+      <w:r>
+        <w:t>pellentesque</w:t>
+      </w:r>
+      <w:proofErr w:type="spellEnd"/>
+      <w:r>
+        <w:t xml:space="preserve"> </w:t>
+      </w:r>
+      <w:proofErr w:type="spellStart"/>
+      <w:r>
+        <w:t>amet</w:t>
+      </w:r>
+      <w:proofErr w:type="spellEnd"/>
+      <w:r>
+        <w:t xml:space="preserve"> </w:t>
+      </w:r>
+      <w:proofErr w:type="spellStart"/>
+      <w:r>
+        <w:t>amet</w:t>
+      </w:r>
+      <w:proofErr w:type="spellEnd"/>
+      <w:r>
+        <w:t xml:space="preserve"> </w:t>
+      </w:r>
+      <w:proofErr w:type="spellStart"/>
+      <w:r>
+        <w:t>bibendum</w:t>
+      </w:r>
+      <w:proofErr w:type="spellEnd"/>
+      <w:r>
+        <w:t>.</w:t>
+      </w:r>
+    </w:p>
+    <w:p>
+      <w:pPr>
+        <w:pStyle w:val="Compact"/>
+        <w:numPr>
+          <w:ilvl w:val="0"/>
+          <w:numId w:val="14"/>
+        </w:numPr>
+      </w:pPr>
+      <w:proofErr w:type="spellStart"/>
+      <w:r>
+        <w:t>Himenaeos</w:t>
+      </w:r>
+      <w:proofErr w:type="spellEnd"/>
+      <w:r>
+        <w:t xml:space="preserve"> </w:t>
+      </w:r>
+      <w:proofErr w:type="spellStart"/>
+      <w:r>
+        <w:t>tincidunt</w:t>
+      </w:r>
+      <w:proofErr w:type="spellEnd"/>
+      <w:r>
+        <w:t xml:space="preserve">, auctor </w:t>
+      </w:r>
+      <w:proofErr w:type="spellStart"/>
+      <w:r>
+        <w:t>dapibus</w:t>
+      </w:r>
+      <w:proofErr w:type="spellEnd"/>
+      <w:r>
+        <w:t xml:space="preserve"> </w:t>
+      </w:r>
+      <w:proofErr w:type="spellStart"/>
+      <w:r>
+        <w:t>scelerisque</w:t>
+      </w:r>
+      <w:proofErr w:type="spellEnd"/>
+      <w:r>
+        <w:t xml:space="preserve">, </w:t>
+      </w:r>
+      <w:proofErr w:type="spellStart"/>
+      <w:r>
+        <w:t>montes</w:t>
+      </w:r>
+      <w:proofErr w:type="spellEnd"/>
+      <w:r>
+        <w:t xml:space="preserve"> nunc </w:t>
+      </w:r>
+      <w:proofErr w:type="spellStart"/>
+      <w:r>
+        <w:t>faucibus</w:t>
+      </w:r>
+      <w:proofErr w:type="spellEnd"/>
+      <w:r>
+        <w:t xml:space="preserve"> </w:t>
+      </w:r>
+      <w:proofErr w:type="spellStart"/>
+      <w:r>
+        <w:t>sodales</w:t>
+      </w:r>
+      <w:proofErr w:type="spellEnd"/>
+      <w:r>
+        <w:t xml:space="preserve"> </w:t>
+      </w:r>
+      <w:proofErr w:type="spellStart"/>
+      <w:r>
+        <w:t>malesuada</w:t>
+      </w:r>
+      <w:proofErr w:type="spellEnd"/>
+      <w:r>
+        <w:t xml:space="preserve"> </w:t>
+      </w:r>
+      <w:proofErr w:type="spellStart"/>
+      <w:r>
+        <w:t>ridiculus</w:t>
+      </w:r>
+      <w:proofErr w:type="spellEnd"/>
+      <w:r>
+        <w:t xml:space="preserve"> sed </w:t>
+      </w:r>
+      <w:proofErr w:type="spellStart"/>
+      <w:r>
+        <w:t>cubilia</w:t>
+      </w:r>
+      <w:proofErr w:type="spellEnd"/>
+      <w:r>
+        <w:t xml:space="preserve"> ligula.</w:t>
+      </w:r>
+    </w:p>
+    <w:p>
+      <w:pPr>
+        <w:rPr>
+          <w:rFonts w:ascii="Times New Roman" w:hAnsi="Times New Roman" w:cs="Times New Roman"/>
+        </w:rPr>
+      </w:pPr>
+      <w:r>
+        <w:rPr>
+          <w:rFonts w:ascii="Times New Roman" w:hAnsi="Times New Roman" w:cs="Times New Roman"/>
+        </w:rPr>
+        <w:t xml:space="preserve">Lorem dolor </w:t>
+      </w:r>
+      <w:proofErr w:type="spellStart"/>
+      <w:r>
+        <w:rPr>
+          <w:rFonts w:ascii="Times New Roman" w:hAnsi="Times New Roman" w:cs="Times New Roman"/>
+        </w:rPr>
+        <w:t>interdum</w:t>
+      </w:r>
+      <w:proofErr w:type="spellEnd"/>
+      <w:r>
+        <w:rPr>
+          <w:rFonts w:ascii="Times New Roman" w:hAnsi="Times New Roman" w:cs="Times New Roman"/>
+        </w:rPr>
+        <w:t xml:space="preserve"> </w:t>
+      </w:r>
+      <w:proofErr w:type="spellStart"/>
+      <w:r>
+        <w:rPr>
+          <w:rFonts w:ascii="Times New Roman" w:hAnsi="Times New Roman" w:cs="Times New Roman"/>
+        </w:rPr>
+        <w:t>orci</w:t>
+      </w:r>
+      <w:proofErr w:type="spellEnd"/>
+      <w:r>
+        <w:rPr>
+          <w:rFonts w:ascii="Times New Roman" w:hAnsi="Times New Roman" w:cs="Times New Roman"/>
+        </w:rPr>
+        <w:t xml:space="preserve"> eros </w:t>
+      </w:r>
+      <w:proofErr w:type="spellStart"/>
+      <w:r>
+        <w:rPr>
+          <w:rFonts w:ascii="Times New Roman" w:hAnsi="Times New Roman" w:cs="Times New Roman"/>
+        </w:rPr>
+        <w:t>pellentesque</w:t>
+      </w:r>
+      <w:proofErr w:type="spellEnd"/>
+      <w:r>
+        <w:rPr>
+          <w:rFonts w:ascii="Times New Roman" w:hAnsi="Times New Roman" w:cs="Times New Roman"/>
+        </w:rPr>
+        <w:t xml:space="preserve"> semper </w:t>
+      </w:r>
+      <w:proofErr w:type="spellStart"/>
+      <w:r>
+        <w:rPr>
+          <w:rFonts w:ascii="Times New Roman" w:hAnsi="Times New Roman" w:cs="Times New Roman"/>
+        </w:rPr>
+        <w:t>tristique</w:t>
+      </w:r>
+      <w:proofErr w:type="spellEnd"/>
+      <w:r>
+        <w:rPr>
+          <w:rFonts w:ascii="Times New Roman" w:hAnsi="Times New Roman" w:cs="Times New Roman"/>
+        </w:rPr>
+        <w:t xml:space="preserve">, </w:t>
+      </w:r>
+      <w:proofErr w:type="spellStart"/>
+      <w:r>
+        <w:rPr>
+          <w:rFonts w:ascii="Times New Roman" w:hAnsi="Times New Roman" w:cs="Times New Roman"/>
+        </w:rPr>
+        <w:t>sodales</w:t>
+      </w:r>
+      <w:proofErr w:type="spellEnd"/>
+      <w:r>
+        <w:rPr>
+          <w:rFonts w:ascii="Times New Roman" w:hAnsi="Times New Roman" w:cs="Times New Roman"/>
+        </w:rPr>
+        <w:t xml:space="preserve">, et sed </w:t>
+      </w:r>
+      <w:proofErr w:type="spellStart"/>
+      <w:r>
+        <w:rPr>
+          <w:rFonts w:ascii="Times New Roman" w:hAnsi="Times New Roman" w:cs="Times New Roman"/>
+        </w:rPr>
+        <w:t>ut</w:t>
+      </w:r>
+      <w:proofErr w:type="spellEnd"/>
+      <w:r>
+        <w:rPr>
+          <w:rFonts w:ascii="Times New Roman" w:hAnsi="Times New Roman" w:cs="Times New Roman"/>
+        </w:rPr>
+        <w:t xml:space="preserve">! Porta </w:t>
+      </w:r>
+      <w:proofErr w:type="spellStart"/>
+      <w:r>
+        <w:rPr>
+          <w:rFonts w:ascii="Times New Roman" w:hAnsi="Times New Roman" w:cs="Times New Roman"/>
+        </w:rPr>
+        <w:t>mattis</w:t>
+      </w:r>
+      <w:proofErr w:type="spellEnd"/>
+      <w:r>
+        <w:rPr>
+          <w:rFonts w:ascii="Times New Roman" w:hAnsi="Times New Roman" w:cs="Times New Roman"/>
+        </w:rPr>
+        <w:t xml:space="preserve"> </w:t>
+      </w:r>
+      <w:proofErr w:type="spellStart"/>
+      <w:r>
+        <w:rPr>
+          <w:rFonts w:ascii="Times New Roman" w:hAnsi="Times New Roman" w:cs="Times New Roman"/>
+        </w:rPr>
+        <w:t>natoque</w:t>
+      </w:r>
+      <w:proofErr w:type="spellEnd"/>
+      <w:r>
+        <w:rPr>
+          <w:rFonts w:ascii="Times New Roman" w:hAnsi="Times New Roman" w:cs="Times New Roman"/>
+        </w:rPr>
+        <w:t xml:space="preserve"> et. Ac </w:t>
+      </w:r>
+      <w:proofErr w:type="spellStart"/>
+      <w:r>
+        <w:rPr>
+          <w:rFonts w:ascii="Times New Roman" w:hAnsi="Times New Roman" w:cs="Times New Roman"/>
+        </w:rPr>
+        <w:t>facilisi</w:t>
+      </w:r>
+      <w:proofErr w:type="spellEnd"/>
+      <w:r>
+        <w:rPr>
+          <w:rFonts w:ascii="Times New Roman" w:hAnsi="Times New Roman" w:cs="Times New Roman"/>
+        </w:rPr>
+        <w:t xml:space="preserve"> ipsum </w:t>
+      </w:r>
+      <w:proofErr w:type="spellStart"/>
+      <w:r>
+        <w:rPr>
+          <w:rFonts w:ascii="Times New Roman" w:hAnsi="Times New Roman" w:cs="Times New Roman"/>
+        </w:rPr>
+        <w:t>viverra</w:t>
+      </w:r>
+      <w:proofErr w:type="spellEnd"/>
+      <w:r>
+        <w:rPr>
+          <w:rFonts w:ascii="Times New Roman" w:hAnsi="Times New Roman" w:cs="Times New Roman"/>
+        </w:rPr>
+        <w:t xml:space="preserve"> </w:t>
+      </w:r>
+      <w:proofErr w:type="spellStart"/>
+      <w:r>
+        <w:rPr>
+          <w:rFonts w:ascii="Times New Roman" w:hAnsi="Times New Roman" w:cs="Times New Roman"/>
+        </w:rPr>
+        <w:t>elementum</w:t>
+      </w:r>
+      <w:proofErr w:type="spellEnd"/>
+      <w:r>
+        <w:rPr>
+          <w:rFonts w:ascii="Times New Roman" w:hAnsi="Times New Roman" w:cs="Times New Roman"/>
+        </w:rPr>
+        <w:t xml:space="preserve"> vestibulum ligula </w:t>
+      </w:r>
+      <w:proofErr w:type="spellStart"/>
+      <w:r>
+        <w:rPr>
+          <w:rFonts w:ascii="Times New Roman" w:hAnsi="Times New Roman" w:cs="Times New Roman"/>
+        </w:rPr>
+        <w:t>amet</w:t>
+      </w:r>
+      <w:proofErr w:type="spellEnd"/>
+      <w:r>
+        <w:rPr>
+          <w:rFonts w:ascii="Times New Roman" w:hAnsi="Times New Roman" w:cs="Times New Roman"/>
+        </w:rPr>
+        <w:t xml:space="preserve"> </w:t>
+      </w:r>
+      <w:proofErr w:type="spellStart"/>
+      <w:r>
+        <w:rPr>
+          <w:rFonts w:ascii="Times New Roman" w:hAnsi="Times New Roman" w:cs="Times New Roman"/>
+        </w:rPr>
+        <w:t>enim</w:t>
+      </w:r>
+      <w:proofErr w:type="spellEnd"/>
+      <w:r>
+        <w:rPr>
+          <w:rFonts w:ascii="Times New Roman" w:hAnsi="Times New Roman" w:cs="Times New Roman"/>
+        </w:rPr>
+        <w:t xml:space="preserve"> </w:t>
+      </w:r>
+      <w:proofErr w:type="spellStart"/>
+      <w:r>
+        <w:rPr>
+          <w:rFonts w:ascii="Times New Roman" w:hAnsi="Times New Roman" w:cs="Times New Roman"/>
+        </w:rPr>
+        <w:t>magnis</w:t>
+      </w:r>
+      <w:proofErr w:type="spellEnd"/>
+      <w:r>
+        <w:rPr>
+          <w:rFonts w:ascii="Times New Roman" w:hAnsi="Times New Roman" w:cs="Times New Roman"/>
+        </w:rPr>
+        <w:t xml:space="preserve"> </w:t>
+      </w:r>
+      <w:proofErr w:type="spellStart"/>
+      <w:r>
+        <w:rPr>
+          <w:rFonts w:ascii="Times New Roman" w:hAnsi="Times New Roman" w:cs="Times New Roman"/>
+        </w:rPr>
+        <w:t>luctus</w:t>
+      </w:r>
+      <w:proofErr w:type="spellEnd"/>
+      <w:r>
+        <w:rPr>
+          <w:rFonts w:ascii="Times New Roman" w:hAnsi="Times New Roman" w:cs="Times New Roman"/>
+        </w:rPr>
+        <w:t xml:space="preserve"> </w:t>
+      </w:r>
+      <w:proofErr w:type="spellStart"/>
+      <w:r>
+        <w:rPr>
+          <w:rFonts w:ascii="Times New Roman" w:hAnsi="Times New Roman" w:cs="Times New Roman"/>
+        </w:rPr>
+        <w:t>ullamcorper</w:t>
+      </w:r>
+      <w:proofErr w:type="spellEnd"/>
+      <w:r>
+        <w:rPr>
+          <w:rFonts w:ascii="Times New Roman" w:hAnsi="Times New Roman" w:cs="Times New Roman"/>
+        </w:rPr>
+        <w:t xml:space="preserve">. </w:t>
+      </w:r>
+      <w:proofErr w:type="spellStart"/>
+      <w:r>
+        <w:rPr>
+          <w:rFonts w:ascii="Times New Roman" w:hAnsi="Times New Roman" w:cs="Times New Roman"/>
+        </w:rPr>
+        <w:t>Rhoncus</w:t>
+      </w:r>
+      <w:proofErr w:type="spellEnd"/>
+      <w:r>
+        <w:rPr>
+          <w:rFonts w:ascii="Times New Roman" w:hAnsi="Times New Roman" w:cs="Times New Roman"/>
+        </w:rPr>
+        <w:t xml:space="preserve"> </w:t>
+      </w:r>
+      <w:proofErr w:type="spellStart"/>
+      <w:r>
+        <w:rPr>
+          <w:rFonts w:ascii="Times New Roman" w:hAnsi="Times New Roman" w:cs="Times New Roman"/>
+        </w:rPr>
+        <w:t>rhoncus</w:t>
+      </w:r>
+      <w:proofErr w:type="spellEnd"/>
+      <w:r>
+        <w:rPr>
+          <w:rFonts w:ascii="Times New Roman" w:hAnsi="Times New Roman" w:cs="Times New Roman"/>
+        </w:rPr>
+        <w:t xml:space="preserve"> </w:t>
+      </w:r>
+      <w:proofErr w:type="spellStart"/>
+      <w:r>
+        <w:rPr>
+          <w:rFonts w:ascii="Times New Roman" w:hAnsi="Times New Roman" w:cs="Times New Roman"/>
+        </w:rPr>
+        <w:t>elit</w:t>
+      </w:r>
+      <w:proofErr w:type="spellEnd"/>
+      <w:r>
+        <w:rPr>
+          <w:rFonts w:ascii="Times New Roman" w:hAnsi="Times New Roman" w:cs="Times New Roman"/>
+        </w:rPr>
+        <w:t xml:space="preserve"> in at </w:t>
+      </w:r>
+      <w:proofErr w:type="spellStart"/>
+      <w:r>
+        <w:rPr>
+          <w:rFonts w:ascii="Times New Roman" w:hAnsi="Times New Roman" w:cs="Times New Roman"/>
+        </w:rPr>
+        <w:t>nisl</w:t>
+      </w:r>
+      <w:proofErr w:type="spellEnd"/>
+      <w:r>
+        <w:rPr>
+          <w:rFonts w:ascii="Times New Roman" w:hAnsi="Times New Roman" w:cs="Times New Roman"/>
+        </w:rPr>
+        <w:t xml:space="preserve">. </w:t>
+      </w:r>
+      <w:proofErr w:type="spellStart"/>
+      <w:r>
+        <w:rPr>
+          <w:rFonts w:ascii="Times New Roman" w:hAnsi="Times New Roman" w:cs="Times New Roman"/>
+        </w:rPr>
+        <w:t>Tincidunt</w:t>
+      </w:r>
+      <w:proofErr w:type="spellEnd"/>
+      <w:r>
+        <w:rPr>
+          <w:rFonts w:ascii="Times New Roman" w:hAnsi="Times New Roman" w:cs="Times New Roman"/>
+        </w:rPr>
+        <w:t xml:space="preserve"> habitant sit.</w:t>
+      </w:r>
+    </w:p>
+    <w:p>
+      <w:pPr>
+        <w:pStyle w:val="Compact"/>
+        <w:numPr>
+          <w:ilvl w:val="0"/>
+          <w:numId w:val="13"/>
+        </w:numPr>
+      </w:pPr>
+      <w:proofErr w:type="spellStart"/>
+      <w:r>
+        <w:t>Aptent</w:t>
+      </w:r>
+      <w:proofErr w:type="spellEnd"/>
+      <w:r>
+        <w:t xml:space="preserve"> </w:t>
+      </w:r>
+      <w:proofErr w:type="spellStart"/>
+      <w:r>
+        <w:t>conubia</w:t>
+      </w:r>
+      <w:proofErr w:type="spellEnd"/>
+      <w:r>
+        <w:t xml:space="preserve"> </w:t>
+      </w:r>
+      <w:proofErr w:type="spellStart"/>
+      <w:r>
+        <w:t>quam</w:t>
+      </w:r>
+      <w:proofErr w:type="spellEnd"/>
+      <w:r>
+        <w:t xml:space="preserve"> </w:t>
+      </w:r>
+      <w:proofErr w:type="spellStart"/>
+      <w:r>
+        <w:t>montes</w:t>
+      </w:r>
+      <w:proofErr w:type="spellEnd"/>
+      <w:r>
+        <w:t xml:space="preserve"> id </w:t>
+      </w:r>
+      <w:proofErr w:type="spellStart"/>
+      <w:r>
+        <w:t>sagittis</w:t>
+      </w:r>
+      <w:proofErr w:type="spellEnd"/>
+      <w:r>
+        <w:t>.</w:t>
+      </w:r>
+    </w:p>
+    <w:p>
+      <w:pPr>
+        <w:pStyle w:val="Compact"/>
+        <w:numPr>
+          <w:ilvl w:val="1"/>
+          <w:numId w:val="13"/>
+        </w:numPr>
+      </w:pPr>
+      <w:r>
+        <w:t xml:space="preserve">Mattis nisi </w:t>
+      </w:r>
+      <w:proofErr w:type="spellStart"/>
+      <w:r>
+        <w:t>nascetur</w:t>
+      </w:r>
+      <w:proofErr w:type="spellEnd"/>
+      <w:r>
+        <w:t xml:space="preserve">, </w:t>
+      </w:r>
+      <w:proofErr w:type="spellStart"/>
+      <w:r>
+        <w:t>aliquam</w:t>
+      </w:r>
+      <w:proofErr w:type="spellEnd"/>
+      <w:r>
+        <w:t xml:space="preserve"> </w:t>
+      </w:r>
+      <w:proofErr w:type="spellStart"/>
+      <w:r>
+        <w:t>duis</w:t>
+      </w:r>
+      <w:proofErr w:type="spellEnd"/>
+      <w:r>
+        <w:t xml:space="preserve"> ex, </w:t>
+      </w:r>
+      <w:proofErr w:type="spellStart"/>
+      <w:r>
+        <w:t>tristique</w:t>
+      </w:r>
+      <w:proofErr w:type="spellEnd"/>
+      <w:r>
+        <w:t>.</w:t>
+      </w:r>
+    </w:p>
+    <w:p>
+      <w:pPr>
+        <w:pStyle w:val="Compact"/>
+        <w:numPr>
+          <w:ilvl w:val="2"/>
+          <w:numId w:val="13"/>
+        </w:numPr>
+      </w:pPr>
+      <w:proofErr w:type="spellStart"/>
+      <w:r>
+        <w:t>Imperdiet</w:t>
+      </w:r>
+      <w:proofErr w:type="spellEnd"/>
+      <w:r>
+        <w:t xml:space="preserve"> </w:t>
+      </w:r>
+      <w:proofErr w:type="spellStart"/>
+      <w:r>
+        <w:t>ut</w:t>
+      </w:r>
+      <w:proofErr w:type="spellEnd"/>
+      <w:r>
+        <w:t xml:space="preserve"> dui </w:t>
+      </w:r>
+      <w:proofErr w:type="spellStart"/>
+      <w:r>
+        <w:t>primis</w:t>
+      </w:r>
+      <w:proofErr w:type="spellEnd"/>
+      <w:r>
+        <w:t xml:space="preserve">, sed gravida, at sed </w:t>
+      </w:r>
+      <w:proofErr w:type="spellStart"/>
+      <w:r>
+        <w:t>nulla</w:t>
+      </w:r>
+      <w:proofErr w:type="spellEnd"/>
+      <w:r>
+        <w:t>.</w:t>
+      </w:r>
+    </w:p>
+    <w:p>
+      <w:pPr>
+        <w:pStyle w:val="Compact"/>
+        <w:numPr>
+          <w:ilvl w:val="2"/>
+          <w:numId w:val="13"/>
+        </w:numPr>
+      </w:pPr>
+      <w:r>
+        <w:t xml:space="preserve">Donec ligula </w:t>
+      </w:r>
+      <w:proofErr w:type="spellStart"/>
+      <w:r>
+        <w:t>nulla</w:t>
+      </w:r>
+      <w:proofErr w:type="spellEnd"/>
+      <w:r>
+        <w:t xml:space="preserve"> ac. </w:t>
+      </w:r>
+      <w:proofErr w:type="spellStart"/>
+      <w:r>
+        <w:t>Nisl</w:t>
+      </w:r>
+      <w:proofErr w:type="spellEnd"/>
+      <w:r>
+        <w:t xml:space="preserve"> ac at </w:t>
+      </w:r>
+      <w:proofErr w:type="spellStart"/>
+      <w:r>
+        <w:t>accumsan</w:t>
+      </w:r>
+      <w:proofErr w:type="spellEnd"/>
+      <w:r>
+        <w:t xml:space="preserve"> </w:t>
+      </w:r>
+      <w:proofErr w:type="spellStart"/>
+      <w:r>
+        <w:t>sagittis</w:t>
+      </w:r>
+      <w:proofErr w:type="spellEnd"/>
+      <w:r>
+        <w:t xml:space="preserve"> eros </w:t>
+      </w:r>
+      <w:proofErr w:type="spellStart"/>
+      <w:r>
+        <w:t>felis</w:t>
+      </w:r>
+      <w:proofErr w:type="spellEnd"/>
+      <w:r>
+        <w:t xml:space="preserve"> </w:t>
+      </w:r>
+      <w:proofErr w:type="spellStart"/>
+      <w:r>
+        <w:t>lobortis</w:t>
+      </w:r>
+      <w:proofErr w:type="spellEnd"/>
+      <w:r>
+        <w:t xml:space="preserve"> </w:t>
+      </w:r>
+      <w:proofErr w:type="spellStart"/>
+      <w:r>
+        <w:t>amet</w:t>
+      </w:r>
+      <w:proofErr w:type="spellEnd"/>
+      <w:r>
+        <w:t xml:space="preserve"> nec </w:t>
+      </w:r>
+      <w:proofErr w:type="spellStart"/>
+      <w:r>
+        <w:t>phasellus</w:t>
+      </w:r>
+      <w:proofErr w:type="spellEnd"/>
+      <w:r>
+        <w:t xml:space="preserve"> </w:t>
+      </w:r>
+      <w:proofErr w:type="spellStart"/>
+      <w:r>
+        <w:t>urna</w:t>
+      </w:r>
+      <w:proofErr w:type="spellEnd"/>
+      <w:r>
+        <w:t xml:space="preserve"> </w:t>
+      </w:r>
+      <w:proofErr w:type="spellStart"/>
+      <w:r>
+        <w:t>bibendum</w:t>
+      </w:r>
+      <w:proofErr w:type="spellEnd"/>
+      <w:r>
+        <w:t xml:space="preserve"> </w:t>
+      </w:r>
+      <w:proofErr w:type="spellStart"/>
+      <w:r>
+        <w:t>sapien</w:t>
+      </w:r>
+      <w:proofErr w:type="spellEnd"/>
+      <w:r>
+        <w:t>.</w:t>
+      </w:r>
+    </w:p>
+    <w:p>
+      <w:pPr>
+        <w:pStyle w:val="Compact"/>
+        <w:numPr>
+          <w:ilvl w:val="1"/>
+          <w:numId w:val="13"/>
+        </w:numPr>
+      </w:pPr>
+      <w:r>
+        <w:t xml:space="preserve">Eu dui ac id, dictum </w:t>
+      </w:r>
+      <w:proofErr w:type="spellStart"/>
+      <w:r>
+        <w:t>proin</w:t>
+      </w:r>
+      <w:proofErr w:type="spellEnd"/>
+      <w:r>
+        <w:t xml:space="preserve"> </w:t>
+      </w:r>
+      <w:proofErr w:type="spellStart"/>
+      <w:r>
+        <w:t>consectetur</w:t>
+      </w:r>
+      <w:proofErr w:type="spellEnd"/>
+      <w:r>
+        <w:t xml:space="preserve"> convallis.</w:t>
+      </w:r>
+    </w:p>
+    <w:p>
+      <w:pPr>
+        <w:pStyle w:val="Compact"/>
+        <w:numPr>
+          <w:ilvl w:val="0"/>
+          <w:numId w:val="13"/>
+        </w:numPr>
+      </w:pPr>
+      <w:proofErr w:type="spellStart"/>
+      <w:r>
+        <w:t>Facilisi</w:t>
+      </w:r>
+      <w:proofErr w:type="spellEnd"/>
+      <w:r>
+        <w:t xml:space="preserve"> </w:t>
+      </w:r>
+      <w:proofErr w:type="spellStart"/>
+      <w:r>
+        <w:t>eu</w:t>
+      </w:r>
+      <w:proofErr w:type="spellEnd"/>
+      <w:r>
+        <w:t xml:space="preserve"> </w:t>
+      </w:r>
+      <w:proofErr w:type="spellStart"/>
+      <w:r>
+        <w:t>lectus</w:t>
+      </w:r>
+      <w:proofErr w:type="spellEnd"/>
+      <w:r>
+        <w:t xml:space="preserve"> </w:t>
+      </w:r>
+      <w:proofErr w:type="spellStart"/>
+      <w:r>
+        <w:t>mauris</w:t>
+      </w:r>
+      <w:proofErr w:type="spellEnd"/>
+      <w:r>
+        <w:t xml:space="preserve"> lorem. Et sed </w:t>
+      </w:r>
+      <w:proofErr w:type="spellStart"/>
+      <w:r>
+        <w:t>sapien</w:t>
+      </w:r>
+      <w:proofErr w:type="spellEnd"/>
+      <w:r>
+        <w:t xml:space="preserve"> </w:t>
+      </w:r>
+      <w:proofErr w:type="spellStart"/>
+      <w:r>
+        <w:t>pellentesque</w:t>
+      </w:r>
+      <w:proofErr w:type="spellEnd"/>
+      <w:r>
+        <w:t xml:space="preserve"> sed </w:t>
+      </w:r>
+      <w:proofErr w:type="spellStart"/>
+      <w:r>
+        <w:t>etiam</w:t>
+      </w:r>
+      <w:proofErr w:type="spellEnd"/>
+      <w:r>
+        <w:t xml:space="preserve"> </w:t>
+      </w:r>
+      <w:proofErr w:type="spellStart"/>
+      <w:r>
+        <w:t>vehicula</w:t>
+      </w:r>
+      <w:proofErr w:type="spellEnd"/>
+      <w:r>
+        <w:t>.</w:t>
+      </w:r>
+    </w:p>
+    <w:p>
+      <w:pPr>
+        <w:pStyle w:val="Compact"/>
+        <w:numPr>
+          <w:ilvl w:val="0"/>
+          <w:numId w:val="13"/>
+        </w:numPr>
+      </w:pPr>
+      <w:r>
+        <w:t xml:space="preserve">In </w:t>
+      </w:r>
+      <w:proofErr w:type="spellStart"/>
+      <w:r>
+        <w:t>porttitor</w:t>
+      </w:r>
+      <w:proofErr w:type="spellEnd"/>
+      <w:r>
+        <w:t xml:space="preserve"> id lorem </w:t>
+      </w:r>
+      <w:proofErr w:type="spellStart"/>
+      <w:r>
+        <w:t>eu</w:t>
+      </w:r>
+      <w:proofErr w:type="spellEnd"/>
+      <w:r>
+        <w:t xml:space="preserve"> </w:t>
+      </w:r>
+      <w:proofErr w:type="spellStart"/>
+      <w:r>
+        <w:t>efficitur</w:t>
+      </w:r>
+      <w:proofErr w:type="spellEnd"/>
+      <w:r>
+        <w:t xml:space="preserve">, </w:t>
+      </w:r>
+      <w:proofErr w:type="spellStart"/>
+      <w:r>
+        <w:t>nisl</w:t>
+      </w:r>
+      <w:proofErr w:type="spellEnd"/>
+      <w:r>
+        <w:t xml:space="preserve"> dis!</w:t>
+      </w:r>
+    </w:p>
+    <w:p>
+      <w:pPr>
+        <w:pStyle w:val="Heading2"/>
+      </w:pPr>
+      <w:bookmarkStart w:id="2" w:name="_Toc155468946"/>
+      <w:bookmarkStart w:id="3" w:name="reference"/>
+      <w:r>
+        <w:t>Reference</w:t>
+      </w:r>
+      <w:bookmarkEnd w:id="2"/>
+    </w:p>
+    <w:p>
+      <w:pPr>
         <w:pStyle w:val="BodyText"/>
       </w:pPr>
+      <w:r>
+        <w:t xml:space="preserve">see figure </w:t>
+      </w:r>
+      <w:hyperlink w:anchor="boxplot">
+        <w:r>
+          <w:fldChar w:fldCharType="begin"/>
+        </w:r>
+        <w:r>
+          <w:instrText xml:space="preserve"> REF boxplot \h</w:instrText>
+        </w:r>
+        <w:r>
+          <w:instrText xml:space="preserve"> \* MERGEFORMAT </w:instrText>
+        </w:r>
+        <w:r>
+          <w:fldChar w:fldCharType="separate"/>
+        </w:r>
+        <w:r>
+          <w:rPr>
+            <w:b/>
+            <w:noProof/>
+          </w:rPr>
+          <w:t>1</w:t>
+        </w:r>
+        <w:r>
+          <w:fldChar w:fldCharType="end"/>
+        </w:r>
+      </w:hyperlink>
+      <w:r>
+        <w:t xml:space="preserve"> and table </w:t>
+      </w:r>
+      <w:hyperlink w:anchor="mtcars">
+        <w:r>
+          <w:fldChar w:fldCharType="begin"/>
+        </w:r>
+        <w:r>
+          <w:instrText xml:space="preserve"> REF mtcars \h</w:instrText>
+        </w:r>
+        <w:r>
+          <w:instrText xml:space="preserve"> \* MERGEFORMAT </w:instrText>
+        </w:r>
+        <w:r>
+          <w:fldChar w:fldCharType="separate"/>
+        </w:r>
+        <w:r>
+          <w:rPr>
+            <w:b/>
+            <w:noProof/>
+          </w:rPr>
+          <w:t>1</w:t>
+        </w:r>
+        <w:r>
+          <w:fldChar w:fldCharType="end"/>
+        </w:r>
+      </w:hyperlink>
+      <w:r>
+        <w:t>!</w:t>
+      </w:r>
+      <w:bookmarkEnd w:id="3"/>
     </w:p>
     <w:sectPr>
       <w:pgSz w:w="12240" w:h="15840"/>
@@ -1566,7 +3755,7 @@
 </file>
 
 <file path=word/endnotes.xml><?xml version="1.0" encoding="utf-8"?>
-<w:endnotes xmlns:wpc="http://schemas.microsoft.com/office/word/2010/wordprocessingCanvas" xmlns:cx="http://schemas.microsoft.com/office/drawing/2014/chartex" xmlns:cx1="http://schemas.microsoft.com/office/drawing/2015/9/8/chartex" xmlns:cx2="http://schemas.microsoft.com/office/drawing/2015/10/21/chartex" xmlns:cx3="http://schemas.microsoft.com/office/drawing/2016/5/9/chartex" xmlns:cx4="http://schemas.microsoft.com/office/drawing/2016/5/10/chartex" xmlns:cx5="http://schemas.microsoft.com/office/drawing/2016/5/11/chartex" xmlns:cx6="http://schemas.microsoft.com/office/drawing/2016/5/12/chartex" xmlns:cx7="http://schemas.microsoft.com/office/drawing/2016/5/13/chartex" xmlns:cx8="http://schemas.microsoft.com/office/drawing/2016/5/14/chartex" xmlns:mc="http://schemas.openxmlformats.org/markup-compatibility/2006" xmlns:aink="http://schemas.microsoft.com/office/drawing/2016/ink" xmlns:am3d="http://schemas.microsoft.com/office/drawing/2017/model3d" xmlns:o="urn:schemas-microsoft-com:office:office" xmlns:oel="http://schemas.microsoft.com/office/2019/extlst" xmlns:r="http://schemas.openxmlformats.org/officeDocument/2006/relationships" xmlns:m="http://schemas.openxmlformats.org/officeDocument/2006/math" xmlns:v="urn:schemas-microsoft-com:vml" xmlns:wp14="http://schemas.microsoft.com/office/word/2010/wordprocessingDrawing" xmlns:wp="http://schemas.openxmlformats.org/drawingml/2006/wordprocessingDrawing" xmlns:w10="urn:schemas-microsoft-com:office:word" xmlns:w="http://schemas.openxmlformats.org/wordprocessingml/2006/main" xmlns:w14="http://schemas.microsoft.com/office/word/2010/wordml" xmlns:w15="http://schemas.microsoft.com/office/word/2012/wordml" xmlns:w16cex="http://schemas.microsoft.com/office/word/2018/wordml/cex" xmlns:w16cid="http://schemas.microsoft.com/office/word/2016/wordml/cid" xmlns:w16="http://schemas.microsoft.com/office/word/2018/wordml" xmlns:w16sdtdh="http://schemas.microsoft.com/office/word/2020/wordml/sdtdatahash" xmlns:w16se="http://schemas.microsoft.com/office/word/2015/wordml/symex" xmlns:wpg="http://schemas.microsoft.com/office/word/2010/wordprocessingGroup" xmlns:wpi="http://schemas.microsoft.com/office/word/2010/wordprocessingInk" xmlns:wne="http://schemas.microsoft.com/office/word/2006/wordml" xmlns:wps="http://schemas.microsoft.com/office/word/2010/wordprocessingShape" mc:Ignorable="w14 w15 w16se w16cid w16 w16cex w16sdtdh wp14">
+<w:endnotes xmlns:wpc="http://schemas.microsoft.com/office/word/2010/wordprocessingCanvas" xmlns:cx="http://schemas.microsoft.com/office/drawing/2014/chartex" xmlns:cx1="http://schemas.microsoft.com/office/drawing/2015/9/8/chartex" xmlns:cx2="http://schemas.microsoft.com/office/drawing/2015/10/21/chartex" xmlns:cx3="http://schemas.microsoft.com/office/drawing/2016/5/9/chartex" xmlns:cx4="http://schemas.microsoft.com/office/drawing/2016/5/10/chartex" xmlns:cx5="http://schemas.microsoft.com/office/drawing/2016/5/11/chartex" xmlns:cx6="http://schemas.microsoft.com/office/drawing/2016/5/12/chartex" xmlns:cx7="http://schemas.microsoft.com/office/drawing/2016/5/13/chartex" xmlns:cx8="http://schemas.microsoft.com/office/drawing/2016/5/14/chartex" xmlns:mc="http://schemas.openxmlformats.org/markup-compatibility/2006" xmlns:aink="http://schemas.microsoft.com/office/drawing/2016/ink" xmlns:am3d="http://schemas.microsoft.com/office/drawing/2017/model3d" xmlns:o="urn:schemas-microsoft-com:office:office" xmlns:oel="http://schemas.microsoft.com/office/2019/extlst" xmlns:r="http://schemas.openxmlformats.org/officeDocument/2006/relationships" xmlns:m="http://schemas.openxmlformats.org/officeDocument/2006/math" xmlns:v="urn:schemas-microsoft-com:vml" xmlns:wp14="http://schemas.microsoft.com/office/word/2010/wordprocessingDrawing" xmlns:wp="http://schemas.openxmlformats.org/drawingml/2006/wordprocessingDrawing" xmlns:w10="urn:schemas-microsoft-com:office:word" xmlns:w="http://schemas.openxmlformats.org/wordprocessingml/2006/main" xmlns:w14="http://schemas.microsoft.com/office/word/2010/wordml" xmlns:w15="http://schemas.microsoft.com/office/word/2012/wordml" xmlns:w16cex="http://schemas.microsoft.com/office/word/2018/wordml/cex" xmlns:w16cid="http://schemas.microsoft.com/office/word/2016/wordml/cid" xmlns:w16="http://schemas.microsoft.com/office/word/2018/wordml" xmlns:w16du="http://schemas.microsoft.com/office/word/2023/wordml/word16du" xmlns:w16sdtdh="http://schemas.microsoft.com/office/word/2020/wordml/sdtdatahash" xmlns:w16sdtfl="http://schemas.microsoft.com/office/word/2024/wordml/sdtformatlock" xmlns:w16se="http://schemas.microsoft.com/office/word/2015/wordml/symex" xmlns:wpg="http://schemas.microsoft.com/office/word/2010/wordprocessingGroup" xmlns:wpi="http://schemas.microsoft.com/office/word/2010/wordprocessingInk" xmlns:wne="http://schemas.microsoft.com/office/word/2006/wordml" xmlns:wps="http://schemas.microsoft.com/office/word/2010/wordprocessingShape" mc:Ignorable="w14 w15 w16se w16cid w16 w16cex w16sdtdh w16sdtfl w16du wp14">
   <w:endnote w:type="separator" w:id="-1">
     <w:p>
       <w:pPr>
@@ -1591,7 +3780,7 @@
 </file>
 
 <file path=word/footnotes.xml><?xml version="1.0" encoding="utf-8"?>
-<w:footnotes xmlns:wpc="http://schemas.microsoft.com/office/word/2010/wordprocessingCanvas" xmlns:cx="http://schemas.microsoft.com/office/drawing/2014/chartex" xmlns:cx1="http://schemas.microsoft.com/office/drawing/2015/9/8/chartex" xmlns:cx2="http://schemas.microsoft.com/office/drawing/2015/10/21/chartex" xmlns:cx3="http://schemas.microsoft.com/office/drawing/2016/5/9/chartex" xmlns:cx4="http://schemas.microsoft.com/office/drawing/2016/5/10/chartex" xmlns:cx5="http://schemas.microsoft.com/office/drawing/2016/5/11/chartex" xmlns:cx6="http://schemas.microsoft.com/office/drawing/2016/5/12/chartex" xmlns:cx7="http://schemas.microsoft.com/office/drawing/2016/5/13/chartex" xmlns:cx8="http://schemas.microsoft.com/office/drawing/2016/5/14/chartex" xmlns:mc="http://schemas.openxmlformats.org/markup-compatibility/2006" xmlns:aink="http://schemas.microsoft.com/office/drawing/2016/ink" xmlns:am3d="http://schemas.microsoft.com/office/drawing/2017/model3d" xmlns:o="urn:schemas-microsoft-com:office:office" xmlns:oel="http://schemas.microsoft.com/office/2019/extlst" xmlns:r="http://schemas.openxmlformats.org/officeDocument/2006/relationships" xmlns:m="http://schemas.openxmlformats.org/officeDocument/2006/math" xmlns:v="urn:schemas-microsoft-com:vml" xmlns:wp14="http://schemas.microsoft.com/office/word/2010/wordprocessingDrawing" xmlns:wp="http://schemas.openxmlformats.org/drawingml/2006/wordprocessingDrawing" xmlns:w10="urn:schemas-microsoft-com:office:word" xmlns:w="http://schemas.openxmlformats.org/wordprocessingml/2006/main" xmlns:w14="http://schemas.microsoft.com/office/word/2010/wordml" xmlns:w15="http://schemas.microsoft.com/office/word/2012/wordml" xmlns:w16cex="http://schemas.microsoft.com/office/word/2018/wordml/cex" xmlns:w16cid="http://schemas.microsoft.com/office/word/2016/wordml/cid" xmlns:w16="http://schemas.microsoft.com/office/word/2018/wordml" xmlns:w16sdtdh="http://schemas.microsoft.com/office/word/2020/wordml/sdtdatahash" xmlns:w16se="http://schemas.microsoft.com/office/word/2015/wordml/symex" xmlns:wpg="http://schemas.microsoft.com/office/word/2010/wordprocessingGroup" xmlns:wpi="http://schemas.microsoft.com/office/word/2010/wordprocessingInk" xmlns:wne="http://schemas.microsoft.com/office/word/2006/wordml" xmlns:wps="http://schemas.microsoft.com/office/word/2010/wordprocessingShape" mc:Ignorable="w14 w15 w16se w16cid w16 w16cex w16sdtdh wp14">
+<w:footnotes xmlns:wpc="http://schemas.microsoft.com/office/word/2010/wordprocessingCanvas" xmlns:cx="http://schemas.microsoft.com/office/drawing/2014/chartex" xmlns:cx1="http://schemas.microsoft.com/office/drawing/2015/9/8/chartex" xmlns:cx2="http://schemas.microsoft.com/office/drawing/2015/10/21/chartex" xmlns:cx3="http://schemas.microsoft.com/office/drawing/2016/5/9/chartex" xmlns:cx4="http://schemas.microsoft.com/office/drawing/2016/5/10/chartex" xmlns:cx5="http://schemas.microsoft.com/office/drawing/2016/5/11/chartex" xmlns:cx6="http://schemas.microsoft.com/office/drawing/2016/5/12/chartex" xmlns:cx7="http://schemas.microsoft.com/office/drawing/2016/5/13/chartex" xmlns:cx8="http://schemas.microsoft.com/office/drawing/2016/5/14/chartex" xmlns:mc="http://schemas.openxmlformats.org/markup-compatibility/2006" xmlns:aink="http://schemas.microsoft.com/office/drawing/2016/ink" xmlns:am3d="http://schemas.microsoft.com/office/drawing/2017/model3d" xmlns:o="urn:schemas-microsoft-com:office:office" xmlns:oel="http://schemas.microsoft.com/office/2019/extlst" xmlns:r="http://schemas.openxmlformats.org/officeDocument/2006/relationships" xmlns:m="http://schemas.openxmlformats.org/officeDocument/2006/math" xmlns:v="urn:schemas-microsoft-com:vml" xmlns:wp14="http://schemas.microsoft.com/office/word/2010/wordprocessingDrawing" xmlns:wp="http://schemas.openxmlformats.org/drawingml/2006/wordprocessingDrawing" xmlns:w10="urn:schemas-microsoft-com:office:word" xmlns:w="http://schemas.openxmlformats.org/wordprocessingml/2006/main" xmlns:w14="http://schemas.microsoft.com/office/word/2010/wordml" xmlns:w15="http://schemas.microsoft.com/office/word/2012/wordml" xmlns:w16cex="http://schemas.microsoft.com/office/word/2018/wordml/cex" xmlns:w16cid="http://schemas.microsoft.com/office/word/2016/wordml/cid" xmlns:w16="http://schemas.microsoft.com/office/word/2018/wordml" xmlns:w16du="http://schemas.microsoft.com/office/word/2023/wordml/word16du" xmlns:w16sdtdh="http://schemas.microsoft.com/office/word/2020/wordml/sdtdatahash" xmlns:w16sdtfl="http://schemas.microsoft.com/office/word/2024/wordml/sdtformatlock" xmlns:w16se="http://schemas.microsoft.com/office/word/2015/wordml/symex" xmlns:wpg="http://schemas.microsoft.com/office/word/2010/wordprocessingGroup" xmlns:wpi="http://schemas.microsoft.com/office/word/2010/wordprocessingInk" xmlns:wne="http://schemas.microsoft.com/office/word/2006/wordml" xmlns:wps="http://schemas.microsoft.com/office/word/2010/wordprocessingShape" mc:Ignorable="w14 w15 w16se w16cid w16 w16cex w16sdtdh w16sdtfl w16du wp14">
   <w:footnote w:type="separator" w:id="-1">
     <w:p>
       <w:r>
@@ -1610,7 +3799,7 @@
 </file>
 
 <file path=word/numbering.xml><?xml version="1.0" encoding="utf-8"?>
-<w:numbering xmlns:wpc="http://schemas.microsoft.com/office/word/2010/wordprocessingCanvas" xmlns:cx="http://schemas.microsoft.com/office/drawing/2014/chartex" xmlns:cx1="http://schemas.microsoft.com/office/drawing/2015/9/8/chartex" xmlns:cx2="http://schemas.microsoft.com/office/drawing/2015/10/21/chartex" xmlns:cx3="http://schemas.microsoft.com/office/drawing/2016/5/9/chartex" xmlns:cx4="http://schemas.microsoft.com/office/drawing/2016/5/10/chartex" xmlns:cx5="http://schemas.microsoft.com/office/drawing/2016/5/11/chartex" xmlns:cx6="http://schemas.microsoft.com/office/drawing/2016/5/12/chartex" xmlns:cx7="http://schemas.microsoft.com/office/drawing/2016/5/13/chartex" xmlns:cx8="http://schemas.microsoft.com/office/drawing/2016/5/14/chartex" xmlns:mc="http://schemas.openxmlformats.org/markup-compatibility/2006" xmlns:aink="http://schemas.microsoft.com/office/drawing/2016/ink" xmlns:am3d="http://schemas.microsoft.com/office/drawing/2017/model3d" xmlns:o="urn:schemas-microsoft-com:office:office" xmlns:oel="http://schemas.microsoft.com/office/2019/extlst" xmlns:r="http://schemas.openxmlformats.org/officeDocument/2006/relationships" xmlns:m="http://schemas.openxmlformats.org/officeDocument/2006/math" xmlns:v="urn:schemas-microsoft-com:vml" xmlns:wp14="http://schemas.microsoft.com/office/word/2010/wordprocessingDrawing" xmlns:wp="http://schemas.openxmlformats.org/drawingml/2006/wordprocessingDrawing" xmlns:w10="urn:schemas-microsoft-com:office:word" xmlns:w="http://schemas.openxmlformats.org/wordprocessingml/2006/main" xmlns:w14="http://schemas.microsoft.com/office/word/2010/wordml" xmlns:w15="http://schemas.microsoft.com/office/word/2012/wordml" xmlns:w16cex="http://schemas.microsoft.com/office/word/2018/wordml/cex" xmlns:w16cid="http://schemas.microsoft.com/office/word/2016/wordml/cid" xmlns:w16="http://schemas.microsoft.com/office/word/2018/wordml" xmlns:w16sdtdh="http://schemas.microsoft.com/office/word/2020/wordml/sdtdatahash" xmlns:w16se="http://schemas.microsoft.com/office/word/2015/wordml/symex" xmlns:wpg="http://schemas.microsoft.com/office/word/2010/wordprocessingGroup" xmlns:wpi="http://schemas.microsoft.com/office/word/2010/wordprocessingInk" xmlns:wne="http://schemas.microsoft.com/office/word/2006/wordml" xmlns:wps="http://schemas.microsoft.com/office/word/2010/wordprocessingShape" mc:Ignorable="w14 w15 w16se w16cid w16 w16cex w16sdtdh wp14">
+<w:numbering xmlns:wpc="http://schemas.microsoft.com/office/word/2010/wordprocessingCanvas" xmlns:cx="http://schemas.microsoft.com/office/drawing/2014/chartex" xmlns:cx1="http://schemas.microsoft.com/office/drawing/2015/9/8/chartex" xmlns:cx2="http://schemas.microsoft.com/office/drawing/2015/10/21/chartex" xmlns:cx3="http://schemas.microsoft.com/office/drawing/2016/5/9/chartex" xmlns:cx4="http://schemas.microsoft.com/office/drawing/2016/5/10/chartex" xmlns:cx5="http://schemas.microsoft.com/office/drawing/2016/5/11/chartex" xmlns:cx6="http://schemas.microsoft.com/office/drawing/2016/5/12/chartex" xmlns:cx7="http://schemas.microsoft.com/office/drawing/2016/5/13/chartex" xmlns:cx8="http://schemas.microsoft.com/office/drawing/2016/5/14/chartex" xmlns:mc="http://schemas.openxmlformats.org/markup-compatibility/2006" xmlns:aink="http://schemas.microsoft.com/office/drawing/2016/ink" xmlns:am3d="http://schemas.microsoft.com/office/drawing/2017/model3d" xmlns:o="urn:schemas-microsoft-com:office:office" xmlns:oel="http://schemas.microsoft.com/office/2019/extlst" xmlns:r="http://schemas.openxmlformats.org/officeDocument/2006/relationships" xmlns:m="http://schemas.openxmlformats.org/officeDocument/2006/math" xmlns:v="urn:schemas-microsoft-com:vml" xmlns:wp14="http://schemas.microsoft.com/office/word/2010/wordprocessingDrawing" xmlns:wp="http://schemas.openxmlformats.org/drawingml/2006/wordprocessingDrawing" xmlns:w10="urn:schemas-microsoft-com:office:word" xmlns:w="http://schemas.openxmlformats.org/wordprocessingml/2006/main" xmlns:w14="http://schemas.microsoft.com/office/word/2010/wordml" xmlns:w15="http://schemas.microsoft.com/office/word/2012/wordml" xmlns:w16cex="http://schemas.microsoft.com/office/word/2018/wordml/cex" xmlns:w16cid="http://schemas.microsoft.com/office/word/2016/wordml/cid" xmlns:w16="http://schemas.microsoft.com/office/word/2018/wordml" xmlns:w16du="http://schemas.microsoft.com/office/word/2023/wordml/word16du" xmlns:w16sdtdh="http://schemas.microsoft.com/office/word/2020/wordml/sdtdatahash" xmlns:w16sdtfl="http://schemas.microsoft.com/office/word/2024/wordml/sdtformatlock" xmlns:w16se="http://schemas.microsoft.com/office/word/2015/wordml/symex" xmlns:wpg="http://schemas.microsoft.com/office/word/2010/wordprocessingGroup" xmlns:wpi="http://schemas.microsoft.com/office/word/2010/wordprocessingInk" xmlns:wne="http://schemas.microsoft.com/office/word/2006/wordml" xmlns:wps="http://schemas.microsoft.com/office/word/2010/wordprocessingShape" mc:Ignorable="w14 w15 w16se w16cid w16 w16cex w16sdtdh w16sdtfl w16du wp14">
   <w:abstractNum w:abstractNumId="0" w15:restartNumberingAfterBreak="0">
     <w:nsid w:val="E17F69BA"/>
     <w:multiLevelType w:val="multilevel"/>
@@ -1889,6 +4078,169 @@
     </w:lvl>
   </w:abstractNum>
   <w:abstractNum w:abstractNumId="11" w15:restartNumberingAfterBreak="0">
+    <w:nsid w:val="0000A991"/>
+    <w:multiLevelType w:val="multilevel"/>
+    <w:tmpl w:val="5ECA09D2"/>
+    <w:lvl w:ilvl="0">
+      <w:numFmt w:val="bullet"/>
+      <w:lvlText w:val="•"/>
+      <w:lvlJc w:val="left"/>
+      <w:pPr>
+        <w:ind w:left="720" w:hanging="480"/>
+      </w:pPr>
+    </w:lvl>
+    <w:lvl w:ilvl="1">
+      <w:numFmt w:val="bullet"/>
+      <w:lvlText w:val="–"/>
+      <w:lvlJc w:val="left"/>
+      <w:pPr>
+        <w:ind w:left="1440" w:hanging="480"/>
+      </w:pPr>
+    </w:lvl>
+    <w:lvl w:ilvl="2">
+      <w:numFmt w:val="bullet"/>
+      <w:lvlText w:val="•"/>
+      <w:lvlJc w:val="left"/>
+      <w:pPr>
+        <w:ind w:left="2160" w:hanging="480"/>
+      </w:pPr>
+    </w:lvl>
+    <w:lvl w:ilvl="3">
+      <w:numFmt w:val="bullet"/>
+      <w:lvlText w:val="–"/>
+      <w:lvlJc w:val="left"/>
+      <w:pPr>
+        <w:ind w:left="2880" w:hanging="480"/>
+      </w:pPr>
+    </w:lvl>
+    <w:lvl w:ilvl="4">
+      <w:numFmt w:val="bullet"/>
+      <w:lvlText w:val="•"/>
+      <w:lvlJc w:val="left"/>
+      <w:pPr>
+        <w:ind w:left="3600" w:hanging="480"/>
+      </w:pPr>
+    </w:lvl>
+    <w:lvl w:ilvl="5">
+      <w:numFmt w:val="bullet"/>
+      <w:lvlText w:val="–"/>
+      <w:lvlJc w:val="left"/>
+      <w:pPr>
+        <w:ind w:left="4320" w:hanging="480"/>
+      </w:pPr>
+    </w:lvl>
+    <w:lvl w:ilvl="6">
+      <w:numFmt w:val="bullet"/>
+      <w:lvlText w:val="•"/>
+      <w:lvlJc w:val="left"/>
+      <w:pPr>
+        <w:ind w:left="5040" w:hanging="480"/>
+      </w:pPr>
+    </w:lvl>
+    <w:lvl w:ilvl="7">
+      <w:numFmt w:val="bullet"/>
+      <w:lvlText w:val="–"/>
+      <w:lvlJc w:val="left"/>
+      <w:pPr>
+        <w:ind w:left="5760" w:hanging="480"/>
+      </w:pPr>
+    </w:lvl>
+    <w:lvl w:ilvl="8">
+      <w:numFmt w:val="bullet"/>
+      <w:lvlText w:val="•"/>
+      <w:lvlJc w:val="left"/>
+      <w:pPr>
+        <w:ind w:left="6480" w:hanging="480"/>
+      </w:pPr>
+    </w:lvl>
+  </w:abstractNum>
+  <w:abstractNum w:abstractNumId="12" w15:restartNumberingAfterBreak="0">
+    <w:nsid w:val="00A99411"/>
+    <w:multiLevelType w:val="multilevel"/>
+    <w:tmpl w:val="24FC4F96"/>
+    <w:lvl w:ilvl="0">
+      <w:start w:val="1"/>
+      <w:numFmt w:val="decimal"/>
+      <w:lvlText w:val="%1."/>
+      <w:lvlJc w:val="left"/>
+      <w:pPr>
+        <w:ind w:left="720" w:hanging="480"/>
+      </w:pPr>
+    </w:lvl>
+    <w:lvl w:ilvl="1">
+      <w:start w:val="1"/>
+      <w:numFmt w:val="decimal"/>
+      <w:lvlText w:val="%2."/>
+      <w:lvlJc w:val="left"/>
+      <w:pPr>
+        <w:ind w:left="1440" w:hanging="480"/>
+      </w:pPr>
+    </w:lvl>
+    <w:lvl w:ilvl="2">
+      <w:start w:val="1"/>
+      <w:numFmt w:val="decimal"/>
+      <w:lvlText w:val="%3."/>
+      <w:lvlJc w:val="left"/>
+      <w:pPr>
+        <w:ind w:left="2160" w:hanging="480"/>
+      </w:pPr>
+    </w:lvl>
+    <w:lvl w:ilvl="3">
+      <w:start w:val="1"/>
+      <w:numFmt w:val="decimal"/>
+      <w:lvlText w:val="%4."/>
+      <w:lvlJc w:val="left"/>
+      <w:pPr>
+        <w:ind w:left="2880" w:hanging="480"/>
+      </w:pPr>
+    </w:lvl>
+    <w:lvl w:ilvl="4">
+      <w:start w:val="1"/>
+      <w:numFmt w:val="decimal"/>
+      <w:lvlText w:val="%5."/>
+      <w:lvlJc w:val="left"/>
+      <w:pPr>
+        <w:ind w:left="3600" w:hanging="480"/>
+      </w:pPr>
+    </w:lvl>
+    <w:lvl w:ilvl="5">
+      <w:start w:val="1"/>
+      <w:numFmt w:val="decimal"/>
+      <w:lvlText w:val="%6."/>
+      <w:lvlJc w:val="left"/>
+      <w:pPr>
+        <w:ind w:left="4320" w:hanging="480"/>
+      </w:pPr>
+    </w:lvl>
+    <w:lvl w:ilvl="6">
+      <w:start w:val="1"/>
+      <w:numFmt w:val="decimal"/>
+      <w:lvlText w:val="%7."/>
+      <w:lvlJc w:val="left"/>
+      <w:pPr>
+        <w:ind w:left="5040" w:hanging="480"/>
+      </w:pPr>
+    </w:lvl>
+    <w:lvl w:ilvl="7">
+      <w:start w:val="1"/>
+      <w:numFmt w:val="decimal"/>
+      <w:lvlText w:val="%8."/>
+      <w:lvlJc w:val="left"/>
+      <w:pPr>
+        <w:ind w:left="5760" w:hanging="480"/>
+      </w:pPr>
+    </w:lvl>
+    <w:lvl w:ilvl="8">
+      <w:start w:val="1"/>
+      <w:numFmt w:val="decimal"/>
+      <w:lvlText w:val="%9."/>
+      <w:lvlJc w:val="left"/>
+      <w:pPr>
+        <w:ind w:left="6480" w:hanging="480"/>
+      </w:pPr>
+    </w:lvl>
+  </w:abstractNum>
+  <w:abstractNum w:abstractNumId="13" w15:restartNumberingAfterBreak="0">
     <w:nsid w:val="30E4DE8A"/>
     <w:multiLevelType w:val="multilevel"/>
     <w:tmpl w:val="212863C0"/>
@@ -1984,7 +4336,7 @@
     <w:abstractNumId w:val="0"/>
   </w:num>
   <w:num w:numId="2" w16cid:durableId="1882671896">
-    <w:abstractNumId w:val="11"/>
+    <w:abstractNumId w:val="13"/>
   </w:num>
   <w:num w:numId="3" w16cid:durableId="1107964580">
     <w:abstractNumId w:val="10"/>
@@ -2016,11 +4368,104 @@
   <w:num w:numId="12" w16cid:durableId="1762677702">
     <w:abstractNumId w:val="1"/>
   </w:num>
+  <w:num w:numId="13" w16cid:durableId="27948002">
+    <w:abstractNumId w:val="11"/>
+  </w:num>
+  <w:num w:numId="14" w16cid:durableId="1397581591">
+    <w:abstractNumId w:val="12"/>
+    <w:lvlOverride w:ilvl="0">
+      <w:startOverride w:val="1"/>
+    </w:lvlOverride>
+    <w:lvlOverride w:ilvl="1">
+      <w:startOverride w:val="1"/>
+    </w:lvlOverride>
+    <w:lvlOverride w:ilvl="2">
+      <w:startOverride w:val="1"/>
+    </w:lvlOverride>
+    <w:lvlOverride w:ilvl="3">
+      <w:startOverride w:val="1"/>
+    </w:lvlOverride>
+    <w:lvlOverride w:ilvl="4">
+      <w:startOverride w:val="1"/>
+    </w:lvlOverride>
+    <w:lvlOverride w:ilvl="5">
+      <w:startOverride w:val="1"/>
+    </w:lvlOverride>
+    <w:lvlOverride w:ilvl="6">
+      <w:startOverride w:val="1"/>
+    </w:lvlOverride>
+    <w:lvlOverride w:ilvl="7">
+      <w:startOverride w:val="1"/>
+    </w:lvlOverride>
+    <w:lvlOverride w:ilvl="8">
+      <w:startOverride w:val="1"/>
+    </w:lvlOverride>
+  </w:num>
+  <w:num w:numId="15" w16cid:durableId="1170027575">
+    <w:abstractNumId w:val="12"/>
+    <w:lvlOverride w:ilvl="0">
+      <w:startOverride w:val="1"/>
+    </w:lvlOverride>
+    <w:lvlOverride w:ilvl="1">
+      <w:startOverride w:val="1"/>
+    </w:lvlOverride>
+    <w:lvlOverride w:ilvl="2">
+      <w:startOverride w:val="1"/>
+    </w:lvlOverride>
+    <w:lvlOverride w:ilvl="3">
+      <w:startOverride w:val="1"/>
+    </w:lvlOverride>
+    <w:lvlOverride w:ilvl="4">
+      <w:startOverride w:val="1"/>
+    </w:lvlOverride>
+    <w:lvlOverride w:ilvl="5">
+      <w:startOverride w:val="1"/>
+    </w:lvlOverride>
+    <w:lvlOverride w:ilvl="6">
+      <w:startOverride w:val="1"/>
+    </w:lvlOverride>
+    <w:lvlOverride w:ilvl="7">
+      <w:startOverride w:val="1"/>
+    </w:lvlOverride>
+    <w:lvlOverride w:ilvl="8">
+      <w:startOverride w:val="1"/>
+    </w:lvlOverride>
+  </w:num>
+  <w:num w:numId="16" w16cid:durableId="1221526466">
+    <w:abstractNumId w:val="12"/>
+    <w:lvlOverride w:ilvl="0">
+      <w:startOverride w:val="1"/>
+    </w:lvlOverride>
+    <w:lvlOverride w:ilvl="1">
+      <w:startOverride w:val="1"/>
+    </w:lvlOverride>
+    <w:lvlOverride w:ilvl="2">
+      <w:startOverride w:val="1"/>
+    </w:lvlOverride>
+    <w:lvlOverride w:ilvl="3">
+      <w:startOverride w:val="1"/>
+    </w:lvlOverride>
+    <w:lvlOverride w:ilvl="4">
+      <w:startOverride w:val="1"/>
+    </w:lvlOverride>
+    <w:lvlOverride w:ilvl="5">
+      <w:startOverride w:val="1"/>
+    </w:lvlOverride>
+    <w:lvlOverride w:ilvl="6">
+      <w:startOverride w:val="1"/>
+    </w:lvlOverride>
+    <w:lvlOverride w:ilvl="7">
+      <w:startOverride w:val="1"/>
+    </w:lvlOverride>
+    <w:lvlOverride w:ilvl="8">
+      <w:startOverride w:val="1"/>
+    </w:lvlOverride>
+  </w:num>
 </w:numbering>
 </file>
 
 <file path=word/styles.xml><?xml version="1.0" encoding="utf-8"?>
-<w:styles xmlns:mc="http://schemas.openxmlformats.org/markup-compatibility/2006" xmlns:r="http://schemas.openxmlformats.org/officeDocument/2006/relationships" xmlns:w="http://schemas.openxmlformats.org/wordprocessingml/2006/main" xmlns:w14="http://schemas.microsoft.com/office/word/2010/wordml" xmlns:w15="http://schemas.microsoft.com/office/word/2012/wordml" xmlns:w16cex="http://schemas.microsoft.com/office/word/2018/wordml/cex" xmlns:w16cid="http://schemas.microsoft.com/office/word/2016/wordml/cid" xmlns:w16="http://schemas.microsoft.com/office/word/2018/wordml" xmlns:w16sdtdh="http://schemas.microsoft.com/office/word/2020/wordml/sdtdatahash" xmlns:w16se="http://schemas.microsoft.com/office/word/2015/wordml/symex" mc:Ignorable="w14 w15 w16se w16cid w16 w16cex w16sdtdh">
+<w:styles xmlns:mc="http://schemas.openxmlformats.org/markup-compatibility/2006" xmlns:r="http://schemas.openxmlformats.org/officeDocument/2006/relationships" xmlns:w="http://schemas.openxmlformats.org/wordprocessingml/2006/main" xmlns:w14="http://schemas.microsoft.com/office/word/2010/wordml" xmlns:w15="http://schemas.microsoft.com/office/word/2012/wordml" xmlns:w16cex="http://schemas.microsoft.com/office/word/2018/wordml/cex" xmlns:w16cid="http://schemas.microsoft.com/office/word/2016/wordml/cid" xmlns:w16="http://schemas.microsoft.com/office/word/2018/wordml" xmlns:w16du="http://schemas.microsoft.com/office/word/2023/wordml/word16du" xmlns:w16sdtdh="http://schemas.microsoft.com/office/word/2020/wordml/sdtdatahash" xmlns:w16sdtfl="http://schemas.microsoft.com/office/word/2024/wordml/sdtformatlock" xmlns:w16se="http://schemas.microsoft.com/office/word/2015/wordml/symex" mc:Ignorable="w14 w15 w16se w16cid w16 w16cex w16sdtdh w16sdtfl w16du">
   <w:docDefaults>
     <w:rPrDefault>
       <w:rPr>

</xml_diff>